<commit_message>
Skill demo outputs (run 36186852955)
</commit_message>
<xml_diff>
--- a/outputs/skill_demo/review/review.docx
+++ b/outputs/skill_demo/review/review.docx
@@ -29,7 +29,7 @@
     </w:p>
     <w:p>
       <w:r>
-        <w:t>The routine generation of genomic, transcriptomic, proteomic and metabolomic data from the same biological system has turned multi-omics integration from a methodological aspiration into a daily expectation, yet the software landscape answering this demand is fragmented across unsupervised factor-analytic engines, supervised discriminant frameworks, deep representation-learning architectures, pathway-aware aggregators, microbiome-native pipelines and graphical web platforms. This review applies a common set of criteria—input data structures, handling of missingness, supervision regime, scalability, biological target, reproducibility infrastructure and empirical benchmarking—to a curated set of frameworks, packages, workflows and platforms, organised along three axes: the stage at which integration is performed (early, intermediate or late), the degree of supervision required, and the biological question being addressed. We critically discuss general-purpose Bioconductor frameworks such as MultiAssayExperiment, mixOmics, MOFA and pathwayMultiomics; microbiome-centred tools including gNOMO, gNOMO2, PALM and EasyMultiProfiler; and point-and-click platforms such as Profiler, ExpOmics, ExpressVis, the Analyst ecosystem and MONGKIE. EasyMultiProfiler, an R workflow built on SummarizedExperiment and MultiAssayExperiment and organised into extraction, preparation, support, analysis and visualisation modules, is featured as an example of microbiome-centred workflow design that aligns host and microbial assays within standardised data structures. We argue that the field's binding constraint is no longer algorithmic novelty but the absence of shared benchmarks, ground-truth corpora and FAIR-compliant evaluation infrastructure; claims of superiority should therefore be read with caution, and progress will depend less on yet another statistical engine than on reproducible, microbiome-native assessment.</w:t>
+        <w:t>Multi-omics integration has matured from an opportunistic by-product of running several assays on a sample into a distinct analytical discipline, yet the software landscape that supports it remains fragmented across methodological lineages, data structures and reproducibility conventions. This review systematically compares general-purpose integration frameworks — including MOFA and its single-cell extensions, the mixOmics family with DIABLO and mixMC, similarity-network fusion methods and their deep-learning descendants, and graph- and attention-based architectures — alongside microbiome-centred pipelines (phyloseq, QIIME 2, MaAsLin2, ANCOM-BC, metaQuantome, gNOMO, PALM, timeOmics, netOmics), web platforms (MicrobiomeAnalyst, 3Omics), and the workflow managers and multi-assay data structures that underpin reproducible execution. The methodological space is organised around a three-stage taxonomy of early, intermediate and late integration, augmented by orthogonal axes of supervision and knowledge-drivenness, with each tool examined through a consistent critical lens: what it assumes about its inputs, what integration strategy it implements, and how its performance claims hold outside the authors' own benchmarks. EasyMultiProfiler is featured as an R/Bioconductor workflow built on SummarizedExperiment and MultiAssayExperiment that consolidates extraction, preparation, support, analysis and visualisation modules for microbiome and host-microbiome studies. Rather than ranking tools, we use EMP and its alternatives to make the design space legible, highlighting where compositionality, phylogenetic autocorrelation, longitudinal sampling and block-missingness still require deliberate stitching of microbial-aware ingestion, temporal modelling and cross-kingdom integration.</w:t>
       </w:r>
     </w:p>
     <w:p>
@@ -40,7 +40,7 @@
         <w:t xml:space="preserve">Keywords: </w:t>
       </w:r>
       <w:r>
-        <w:t>multi-omics integration; microbiome workflows; data reproducibility; computational benchmarking; integration frameworks; FAIR data</w:t>
+        <w:t>multi-omics integration; microbiome bioinformatics; workflow reproducibility; matrix factorization; data integration software; EasyMultiProfiler</w:t>
       </w:r>
     </w:p>
     <w:p>
@@ -48,32 +48,27 @@
         <w:pStyle w:val="Heading1"/>
       </w:pPr>
       <w:r>
-        <w:t>1. Introduction: why multi-omics integration demands dedicated software</w:t>
+        <w:t>1. Introduction: why multi-omics integration needs dedicated software</w:t>
       </w:r>
     </w:p>
     <w:p>
       <w:r>
-        <w:t>The premise that biological systems can only be understood by simultaneously interrogating multiple molecular layers has, in little more than a decade, moved from methodological aspiration to routine expectation. A single study now routinely combines genomic, transcriptomic, proteomic and metabolomic assays, often at single-cell or spatial resolution, and with metagenomic, metatranscriptomic and metaproteomic layers when the system of interest is a microbial community [1, 2]. Each layer is generated by a different assay, preprocessed by a different toolchain and stored in a different format, with sample overlap that is rarely complete and with technical noise that is not comparable across modalities [3]. The heterogeneity is not cosmetic: it determines which statistical operations are even defined, and propagates through every downstream decision about imputation, normalisation, dimension reduction and testing. The community has produced a correspondingly heterogeneous software landscape, and the practical question for working scientists is no longer whether to integrate but which stack to adopt.</w:t>
+        <w:t>The maturation of high-throughput biology over the past two decades has transformed multi-omics from an opportunistic by-product of profiling a sample with several platforms into an explicit analytical discipline. Where early studies tended to concatenate single-omics outputs at the level of figures or supplementary tables, contemporary cohort and single-cell studies increasingly benefit from modelling molecular layers jointly so that shared regulatory programmes, modality-specific responses and missing-data patterns can be disentangled in a principled way [1, 2, 3]. This shift has been driven by a steady expansion in the layers that can be measured routinely — bulk and single-cell transcriptomics, epigenomics, proteomics, metabolomics, metagenomics, metatranscriptomics and spatial modalities — and by the recognition that most biologically interesting phenotypes arise from interactions across these layers rather than from any one in isolation. The reviews cited above collectively illustrate the breadth of the modality catalogue now in routine use [4, 5, 6]; the specific inventory supported by any given tool is far narrower, and no single platform delivers all of them. The empirical evidence that integration outperforms well-designed single-omics analysis is itself context-dependent: a recent colorectal cancer benchmark comparing eight unsupervised integrative clustering methods on simulated and real TCGA data reported that similarity-network fusion produced the best subtype classification accuracy among them, but performance was sensitive to the simulated correlation structure and no method dominated across all metrics, illustrating that added layers do not automatically deliver added insight [7]. Integration, in other words, is not an end in itself; it is a methodological choice whose value must be defended against well-controlled unimodal alternatives.</w:t>
       </w:r>
     </w:p>
     <w:p>
       <w:r>
-        <w:t>That choice has become harder because the algorithm catalogue has fragmented along several largely independent axes. Unsupervised latent-factor approaches such as Multi-Omics Factor Analysis infer shared and modality-specific variation [4], and the same conceptual core has been carried into single-cell profiling [5] and transfer-learning extensions [6], with the MOFA2 release line representing the actively maintained successor whose broader bulk/single-cell behaviour is not separately characterised in the cited evidence. Matrix-factorisation methods for incomplete multi-omics blocks have been added to the catalogue [7], while parallel network-based meta-analytic frameworks now unify statistical aggregation with similarity-network-fusion-style integration [8]. A separate longitudinal literature models repeated measurements of the same subjects [9, 10], and pathway-aware tools offer functional annotations and biological priors that can be used to improve the interpretability of integrative results [11, 12]. A parallel deep-learning literature frames integration as representation learning rather than decomposition [13, 14, 15, 16, 17], and the single-cell regime has generated its own dedicated probabilistic and graph-linked ecosystems, including scVI and its semi-supervised extension scANVI [18, 19] and totalVI for paired RNA and surface protein measurements [20]. Web-based platforms wrap subsets of these algorithms behind point-and-click interfaces [21, 22, 23, 24, 25], while reproducibly containerised pipelines package yet other subsets for command-line execution [26, 27]. Data structure convergence around MultiAssayExperiment [28] and its single-cell counterpart [29] is partial; file conventions and evaluation metrics remain heterogeneous across the tools reviewed, so applying several methods to the same dataset typically requires substantial engineering effort [30].</w:t>
+        <w:t>The practical consequences of treating integration as a discipline rather than a postscript are now visible across the software landscape. Generic spreadsheets and monolithic pipelines struggle on three fronts simultaneously: sample coverage is rarely balanced across modalities, data formats are heterogeneous even within a single project, and the analytical workflows required to move from raw features to interpretable models are long enough that their conclusions are sensitive to undocumented parameter choices [8, 9]. The result is a well-documented reproducibility crisis in which re-running a published multi-omics analysis rarely yields identical biological conclusions, even when the input data are unchanged. This concern is sharpened in microbiome and host-microbiome settings, where metagenomic, metatranscriptomic, metabolomic and host-response layers each have their own conventions, ontologies and batch-effect structures that must be reconciled before any joint modelling is meaningful [8, 10]. The concern is sharpened further still in clinical cohorts, where the cost of re-analysis mistakes is highest and where standards such as FAIR data objects and reproducible workflow runtimes — declarative pipeline managers such as Snakemake or Nextflow that orchestrate multi-step analyses under a single definition — are now expected rather than aspirational [11].</w:t>
       </w:r>
     </w:p>
     <w:p>
       <w:r>
-        <w:t>Microbiome research sharpens every one of these difficulties. A meaningful microbiome study must coordinate at least four interacting layers — the microbial community, its viruses, its host and the metabolic exchange between them — each profilable by multiple assays with non-overlapping sample sets. Disease-focused work in type 2 diabetes illustrates the gap: reproducible metagenomic signatures can be linked to functional pathways and metabolites, but the chain from genetic potential to expressed activity to host phenotype depends on whether metabolomic, metatranscriptomic and proteomic measurements were obtained on the same individuals [31]. Pipelines such as gNOMO and gNOMO2 address part of this problem for amplicon, metagenomic, metatranscriptomic and metaproteomic data with and without host context [27, 32], and microbiome-aware multi-omics workflows built on standardised R/Bioconductor classes align the microbial and host sides of the problem [3]. Even so, the field lacks a consensus benchmark, and the dominant reviews do not yet agree on what a successful integration should demonstrate.</w:t>
+        <w:t>Closely connected to this shift, software itself has become a first-class research output: methods papers now routinely compete on the basis of architectural choices — whether a tool exposes a unified multi-assay data structure [12], whether it scales to single-cell modalities [13, 14, 15], whether it can be replayed through a workflow manager [11, 16], or whether it offers a graphical interface that lets clinician-scientists participate without writing code [17, 18, 19, 20]. At the same time, the proliferation of specialised tools has produced a fragmentation problem: a typical integrative analysis can plausibly call on a matrix-factorization method, a network-based meta-analyser, a pathway-level integrator and a deep-learning embedder, yet there is little consensus on how these pieces should be composed, and the conceptual framework that ties them together is often left implicit [3]. In our view, even when a conceptual scheme exists, its assumptions about independence between modalities, sparsity of the signal and tolerance for missing data are not always made visible to the user, which complicates both interpretation and reuse.</w:t>
       </w:r>
     </w:p>
     <w:p>
       <w:r>
-        <w:t>A further, often underappreciated, dimension is that integration is not solely a statistical question. The reproducibility crisis in computational biology has shown that the same algorithm, executed by two groups on nominally the same data, can yield qualitatively different results, with the principal sources of divergence being software versions, parameter choices and undocumented preprocessing rather than the mathematical core of the method. FAIR-compliant packaging of multi-omics workflows as Research Object Crates [26], curated simulators such as SUMO for controlled evaluation [33], single-cell multi-omics benchmarks across 47 datasets [34] and comparative studies of 12 integration methods on joint scRNA-seq and scATAC-seq tasks [35] have emerged in response. These efforts reveal that the binding constraint on the field is engineering and infrastructure: data structures such as MultiAssayExperiment [28] and its single-cell counterpart [29], containerised workflow managers and provenance metadata determine which analyses are even tractable before statistical sophistication is brought to bear.</w:t>
-      </w:r>
-    </w:p>
-    <w:p>
-      <w:r>
-        <w:t>Existing reviews of multi-omics software tend to conflate three quite different objects — algorithms, packages and end-to-end workflows — within a single list [2]. The consequence is that a reader finishes such a review no better equipped to choose between, for instance, a deep-learning framework, a factor-analysis package and a microbiome-centred pipeline than before reading it. This review adopts a deliberately narrower ambition: it applies a common set of criteria — input data structures, handling of missingness, supervision, scalability, biological target, reproducibility infrastructure and empirical benchmarking — to a curated set of frameworks, packages, workflows and platforms, and uses those criteria to situate one microbiome-centred workflow as a featured example. The aim is not to crown a winner but to expose, through comparison, the engineering choices that quietly determine which scientific questions are answerable.</w:t>
+        <w:t>This review therefore treats software as the primary object of comparison. We survey general-purpose integration frameworks and methods, microbiome-centred tools, web servers and point-and-click platforms, and the data structures and workflow systems that underpin reproducibility, before focusing in detail on EasyMultiProfiler (EMP), a recently published R workflow that uses the SummarizedExperiment and MultiAssayExperiment classes to deliver a five-module pipeline — extraction, preparation, support, analysis and visualisation — for microbiome and host-microbiome studies [8]. Throughout, we apply a consistent comparative lens that asks what each tool assumes about the data, what integration strategy it implements, what evidence supports its performance claims, and how those claims are qualified when examined critically. The goal is not to rank tools, but to make the design space legible so that users and developers can choose — or build — software whose assumptions match the biological question at hand.</w:t>
       </w:r>
     </w:p>
     <w:p>
@@ -81,32 +76,37 @@
         <w:pStyle w:val="Heading1"/>
       </w:pPr>
       <w:r>
-        <w:t>2. A taxonomy of integration strategies: stages, supervision and biological target</w:t>
+        <w:t>2. A taxonomy of integration strategies</w:t>
       </w:r>
     </w:p>
     <w:p>
       <w:r>
-        <w:t>The term "multi-omics integration" is frequently invoked as though it referred to a single statistical operation, yet the algorithmic landscape encompasses fundamentally different commitments to the data-generating process. Methods as superficially similar as similarity-network fusion and matrix factorisation impose distinct assumptions about the distribution of signal across modalities, the nature of cross-platform concordance, and the role of prior biological knowledge, and a working taxonomy is required before any meaningful comparison of software tools can be undertaken. In what follows, I organise the field along three axes: the stage at which integration is performed (early, intermediate or late), the degree of supervision required (unsupervised, semi-supervised or supervised), and the biological target the analysis is designed to address (subtyping, biomarker selection, longitudinal modelling or dynamic network inference).</w:t>
+        <w:t>The literature on multi-omics integration has converged, almost by convention, into a three-stage taxonomy that distinguishes the moment at which information from multiple assays is combined. In the early-integration paradigm, also termed concatenation-based integration, features from all omics layers are merged into a single design matrix and analysed with one model that treats features as exchangeable predictors under the assumption of joint observation over the same samples. The mixOmics R package provides a canonical realisation through sparse PLS and its multi-block extension DIABLO, in which partial least-squares components are fitted on concatenated feature matrices and forced to be correlated across blocks through a design matrix [21, 22]. MixMC provides a multivariate statistical framework that accounts for the compositional nature of 16S rRNA marker-gene data and supports multi-block integration across body sites [23], and the regularised multi-block family represented by RGCCA/SGCCA consolidates block-specific latent components for exploratory integration of multi-block datasets through generalised canonical correlation analysis [24]. A persistent weakness of this class is that it imposes a single metric and a single noise model on layers whose scales, sparsity and dependence structures differ profoundly; pre-processing choices therefore dominate downstream conclusions, and the literature is conspicuously thin on systematic comparisons of those choices.</w:t>
       </w:r>
     </w:p>
     <w:p>
       <w:r>
-        <w:t>The most informative first axis is integration stage. Early integration concatenates normalised modality matrices into a single design matrix and applies standard multivariate or supervised methods, an approach implemented, for example, in PLS-based workflows within mixOmics [36]. Concatenation preserves the original feature space but ignores modality-specific noise structure and is highly sensitive to differences in scale and feature cardinality. Intermediate integration builds a joint latent representation, either by factor-analytic decomposition as in Multi-Omics Factor Analysis [4], MOTL [6] and Multi-Layer Matrix Factorisation [7], or by graph-based embedding as in SNF [37], MODILM [38] and MO-GCAN [16]. Late, or decision-level, integration trains separate models on each modality and combines their outputs; deep learning frameworks such as DeepMoIC [14] and MOADLN [15] instantiate intermediate integration through latent representation fusion, with downstream classification heads that yield decision-level outputs. Crucially, these three strategies are not interchangeable: the choice of stage changes the failure modes of an analysis, and tools marketed under a single integration label frequently combine stages internally without disclosing the implications.</w:t>
+        <w:t>Intermediate integration postpones the moment of fusion. Joint dimensionality reduction and matrix or tensor factorisations infer a small set of latent variables that approximate all omics matrices simultaneously: MOFA is the canonical example, using a Bayesian factor-analysis framework whose factors are shared across modalities and are interpretable in terms of both common and assay-specific variance [1]; its single-cell extension MOFA+ applies the same logic through variational inference and flexible sparsity priors to multi-modal single-cell data [13]. Related matrix-factorisation-based clustering methods, including multi-layer NMF, semi-supervised deep NMF (SSD-MO), MOTL's transfer-learning extension of MOFA and MLMF, similarly factorise modalities into shared and residual components [25, 26, 27]. Network-based intermediate integration offers a geometric alternative: Similarity Network Fusion constructs a sample-similarity graph per modality and fuses them through message-passing to produce a single affinity matrix usable for clustering [2]; MUUMI extends this paradigm by coupling SNF with interactome inference to identify molecular signatures, although its validation so far has been limited to idiopathic pulmonary fibrosis and macrophage models [9]. The advantage over concatenation is that each modality retains its own geometry; the disadvantage is that the resulting latent space or fused graph no longer carries the original features, complicating biomarker attribution and forcing users into post-hoc loadings analyses.</w:t>
       </w:r>
     </w:p>
     <w:p>
       <w:r>
-        <w:t>The second axis concerns supervision. Unsupervised factor-analytic methods dominate the literature precisely because matched multi-omics cohorts are usually too small to support fully labelled learning; MOFA infers shared and modality-specific latent factors without external labels and then enables downstream subtyping, imputation and outlier detection [4], while mixOmics provides a continuum from unsupervised PLS variants to the supervised discriminant variant DIABLO [36, 39]. Semi-supervised approaches explicitly leverage small labelled subsets alongside large unlabelled ones: SSD-MO combines deep non-negative matrix factorisation with a semi-supervised objective and was shown to improve clustering F-scores on six TCGA datasets [40], although the extent to which these gains generalise beyond cancer subtyping has not been established. Fully supervised frameworks such as the network-based Bayesian method NetMIM [12] and the graph-attention-based MODILM [38] address biomarker selection and disease classification directly, but they depend on the existence of trustworthy endpoints and cannot answer exploratory questions about novel molecular strata.</w:t>
+        <w:t>Late, or decision-level, integration keeps each omics layer analytically separate until the very end, combining only outputs — predictions, scores or rankings — across modalities. The simplest realisation is an ensemble of single-omics classifiers whose votes are aggregated, but the literature now extends this idea to multi-modal Bayesian uncertainty estimation, as in TMODINET, where each omics-specific predictor contributes through Dempster–Shafer fusion rather than naive averaging [28]. Late integration is the natural choice when modalities are simply not co-measured, when one modality is very small, or when each omics platform already has its own gold-standard pipeline whose parameters should not be perturbed. The cost is that cross-omics interactions inside a single sample cannot in principle be recovered without at least one intermediate step somewhere in the workflow.</w:t>
       </w:r>
     </w:p>
     <w:p>
       <w:r>
-        <w:t>The third axis, biological target, distinguishes tools whose statistical machinery is tailored to a specific scientific goal. Sample subtyping is the most heavily studied target: SNF fuses per-modality patient similarity networks and was reported to outperform single-modality analyses and several integration baselines across five cancer cohorts [37], while MLMF extends factorisation to handle partial multi-omics matrices across twelve multi-omics datasets drawn from cancer studies [7], and graph-attention and graph-convolutional approaches such as MO-GCAN [16] and DeepMoIC [14] target the same problem with neural architectures. Biomarker selection is the explicit objective of DIABLO [39] and NetMIM [12], the latter additionally accommodating block missingness through data augmentation. A more specialised target is longitudinal modelling, addressed by timeOmics [9] and PALM [41], with PALM aligning multi-omics time series before reconstructing dynamic Bayesian networks in an inflammatory bowel disease cohort [41]. Dynamic network inference proper, the reconstruction of time-resolved regulatory graphs spanning omics layers, is the central aim of netOmics [10] and PALM [41], and is statistically distinct from subtyping even though both produce graphical outputs.</w:t>
+        <w:t>Cutting across these three stages are two orthogonal axes that are often elided in tool papers. The first is supervision: MOFA is unsupervised [1], DIABLO is supervised by design [22], and a family of recent variational and supervised factor models, including SigMAE, explicitly couples dimensionality reduction with prediction in a single optimisation [29]. The second axis is data-driven versus knowledge-driven integration. Data-driven methods seek latent structure without recourse to prior biology, and most factor and matrix-factorisation work, including MOFA and SNF, falls into this category [1, 2]. Knowledge-driven approaches compress features into pathways, networks or curated ontologies before integration: PathIntegrate transforms molecular data to single-sample pathway scores and applies single- or multi-view predictive models on top [30], while the OmicsNet module of the Analyst suite performs biological-network integration as a third step after single-omics and data-driven integration [19].</w:t>
       </w:r>
     </w:p>
     <w:p>
       <w:r>
-        <w:t>This three-axis taxonomy should not, however, be read as a neutral classification. The benchmarks available do not yet justify a confident ranking across stages: the single-cell integration benchmark of Hu and colleagues reports that Seurat, MOJITOO and scAI outperform other vertical-integration methods on most of the 47 datasets evaluated [34], while a parallel benchmark of joint scRNA-seq and scATAC-seq integration finds that no single method dominates across tasks [35], and neither study examines bulk multi-omics subtyping or longitudinal targets. Conflating similarity-network fusion with matrix factorisation obscures a real methodological contrast: SNF operates by fusing per-modality sample similarity networks [37], whereas factor-analytic methods such as MOFA infer a small number of shared and modality-specific latent axes [4], and empirical benchmarks to date have not formally distinguished these alternative data-generating assumptions. What the literature does not show is that any single axis dominates the others; integrative method choice must therefore be made conditional on the assumed data-generating process, the size and labelling of the cohort, and the specific biological question being asked, and software reviews that ignore these axes risk endorsing tools whose assumptions are violated by the very data they are applied to.</w:t>
+        <w:t>The taxonomy, while pedagogically convenient, is not as crisp as the labels suggest. DIABLO is variously described as "early" and "intermediate" in different papers depending on whether the design matrix or the block structure is emphasised, and supervised variants of MOFA collapse the unsupervised/supervised axis onto what should be a separate methodological decision [1, 22]. Terminology is also unstable across tool papers: "joint dimensionality reduction", "matrix factorisation", "multi-view learning" and "integration" are used almost interchangeably, which is one reason why head-to-head benchmarks frequently disagree on what counts as a baseline. More importantly, the practical choice among strategies is dictated less by algorithmic novelty than by data structure. Matched samples with low missingness favour intermediate factor or network fusion [1, 2]; high sample-to-feature ratios favour concatenation or supervised PLS [21, 22]; block-missing data almost force late integration or pathway-level aggregation [28, 30]; and very small cohorts may require transfer-learning enhancements before any of the above will work reliably [27]. These contingencies explain why no single dominant workflow has emerged from the methodological literature, and they caution against treating any one integration strategy as universally preferable.</w:t>
+      </w:r>
+    </w:p>
+    <w:p>
+      <w:r>
+        <w:t>Several widely used tools fall outside this three-stage scheme without distorting it, and we name them here to clarify the scope rather than dismiss them. Single-cell anchoring methods such as Seurat and the totalVI/scArches/UINMF family addressed cross-technology dataset alignment and missing-modality prediction in single-cell data, which is the primary concern of the benchmarking section rather than this taxonomy [15, 31]. Microbiome-specific standards — MaAsLin2 and ANCOM-BC for differential abundance testing, and mixMC for compositional multi-block analysis — sit at a different level of the stack, providing components for integration rather than full integration strategies [23, 32, 33]. Pathway-level web platforms such as 3Omics are subsumed under the knowledge-driven axis defined above [34]. The taxonomy should be read as a navigation aid for the methods most often invoked in methodological reviews, not as a census of every tool that touches the problem, and our aim here has been to map strategies rather than to rank tools by depth of implementation.</w:t>
       </w:r>
     </w:p>
     <w:p>
@@ -114,37 +114,52 @@
         <w:pStyle w:val="Heading1"/>
       </w:pPr>
       <w:r>
-        <w:t>3. General-purpose statistical and Bioconductor integration frameworks</w:t>
+        <w:t>3. General-purpose integration frameworks and methods</w:t>
       </w:r>
     </w:p>
     <w:p>
       <w:r>
-        <w:t>integration frameworks occupy an unusual position in the multi-omics software landscape: they are not tied to a particular biological question or sample type, but instead supply statistical machinery that operates on whatever blocks the user supplies. Within the R/Bioconductor ecosystem, this category is anchored by the MultiAssayExperiment class, which provides a coordinated representation of diverse assays together with subsetting, reshaping and cross-assay aggregation primitives [28]. MultiAssayExperiment does not enforce any particular model: it is an interchange format on top of which methods such as MOFA, mixOmics or pathway-based routines can be plugged in, and the SingleCellMultiModal Bioconductor package redistributes curated landmark CITE-seq, 10x Multiome and related datasets as MultiAssayExperiment objects to support method development on standardised inputs [29].</w:t>
+        <w:t>General-purpose integrative frameworks for multi-omics data span at least four overlapping algorithmic lineages, each with a distinct conceptual take on what "integration" should mean. They differ sharply in input expectations, scalability, and what counts as a published tool versus a one-off pipeline, and a candid reading of the literature shows that the gap between methodological novelty and reproducible, well-engineered software remains large.</w:t>
       </w:r>
     </w:p>
     <w:p>
       <w:r>
-        <w:t>The most visible statistical engines are the PLS-family methods consolidated in mixOmics, which provides sparse and discriminant variants for dimension reduction and feature selection across multiple 'omics blocks [36]. DIABLO, the supervised extension implemented within the same package, seeks correlated discriminant features across data types and has been adopted for cancer case studies integrating mRNA, miRNA, CpG, protein and metabolite matrices [39]. PLS-based methods are, by construction, linear and rely on cross-block covariance structure; in highly compositional or sparsity-dominated data, such as sparse microbiome count tables with many zeros and strong library-size effects, this construction can yield unstable loading signs and inflated cross-block correlations, so users are well advised to verify the linearity and correlation assumptions empirically before trusting cross-omics feature signatures. This limitation reflects the underlying PLS methodology rather than any specific shortcoming of the mixOmics implementation, and applies to any PLS-derived integrator rather than to mixOmics in particular.</w:t>
+        <w:t>The factor-analysis lineage is dominated by Multi-Omics Factor Analysis and its descendants. The original MOFA infers a set of latent factors that capture both shared and modality-specific variation across heterogeneous omics layers and supports downstream tasks such as sample subgrouping and imputation [1]; MOFA+ generalises this to multi-modal single-cell data using variational inference and flexible sparsity priors, allowing joint modelling across sample groups and modalities [13]. A more recent addition is MOTL, a transfer-learning extension that augments MOFA-style joint matrix factorisation by borrowing latent factor structure from a large heterogeneous "learning" dataset to improve factorisation of limited-sample target data, with validation on simulated data and glioblastoma samples [27]. The transfer-learning formulation is useful in settings with few samples, but its gain over plain MOFA is intrinsically tied to the relevance of the source dataset to the target — a dependence that is rarely probed in head-to-head terms and that cautions against uncritical adoption across biological domains.</w:t>
       </w:r>
     </w:p>
     <w:p>
       <w:r>
-        <w:t>Factor-analytic frameworks relax the assumption of correlated blocks by learning latent factors that can be shared or modality-specific. MOFA was introduced as an unsupervised probabilistic factor model for bulk multi-omics, providing sample subtyping, imputation and outlier detection [4]. The single-cell-focused MOFA+ generalised this formulation with scalable inference and flexible sparsity priors to handle multiple sample groups and modalities such as paired RNA and epigenetic profiling [5]. These models offer probabilistic grounding and factor-level interpretability, but the documented case studies are limited to specific cancer settings [4]; whether MOFA-style factor inference generalises to the zero-inflated compositional distributions typical of microbiome relative abundance matrices, or how factor interpretability behaves as the number of modalities grows beyond three, remains, to our knowledge, untested in the cited primary literature. Extensions such as MOTL have begun to address limited-sample settings by transferring factor structure from larger datasets [6], illustrating that active development of the MOFA family continues beyond the original publications and that conclusions drawn from the original MOFA and MOFA+ studies [4, 5] should not be assumed to characterise the current maintained releases.</w:t>
+        <w:t>The PLS-based integrative lineage is essentially the mixOmics family. mixOmics provides a coherent R package for feature selection, dimension reduction and integration of multiple omics assays through sparse PLS and related variants [21]. Its supervised extension DIABLO identifies correlated subsets of discriminating molecular features across assays and phenotypic groups, offering modular and cross-over study designs and competitive predictive performance relative to supervised approaches while improving biological relevance over unsupervised integrative baselines [22]. MixOmics has had demonstrable reach beyond cancer, including in plant abiotic-stress workflows for vertical and horizontal integration of phenomics, metabolomics, proteomics and transcriptomics [35], which makes it one of the few general-purpose frameworks with broad-domain traction. Its main limitation is conceptual: linear projection in supervised mode can be sensitive to confounded designs, and feature selection on sparse PLS components remains a perennial source of reproducibility discussion.</w:t>
       </w:r>
     </w:p>
     <w:p>
       <w:r>
-        <w:t>A different axis of generality is pursued by pathway-level integration tools. The pathwayMultiomics package provides a roll-up strategy that does not require matched samples and uses a novel MiniMax statistic to prioritise dysregulated pathways across categorical, continuous or survival outcomes [11]. By aggregating features before integration, such methods trade the resolution of gene-level signals for robustness and interpretability; the available excerpt does not address how pathwayMultiomics handles the compositional structure that dominates microbiome data, where correlation networks at the pathway level can be driven by shared denominators rather than shared biology, so its applicability to compositional microbiome inputs should be regarded as untested rather than unsupported.</w:t>
+        <w:t>A third lineage concentrates on similarity-network fusion. The canonical SNF method constructs per-data-type patient similarity networks and fuses them into one integrative network, achieving substantial gains over single-data-type analyses on five cancer datasets [2]. MUUMI unifies statistical meta-analysis with network-based integration by combining SNF with interactome inference to identify robust molecular signatures, though its validation has so far been limited to idiopathic pulmonary fibrosis and THP-1 macrophages [9]. DeepMoIC embeds SNF into a deep Graph Convolutional Network trained on autoencoder-extracted representations for cancer subtyping [36], while MINGLE uses sparse network estimation to merge multi-omics information into an integrated network for glioma heterogeneity [37]. The conceptual unity of this lineage is appealing, but fusion methods are highly sensitive to the choice of similarity metric and to the propagation of hub nodes, and most published implementations do not expose the network's sensitivity to these choices transparently.</w:t>
       </w:r>
     </w:p>
     <w:p>
       <w:r>
-        <w:t>A fourth layer consists of wrapper pipelines that treat the proliferation of integration methods as a usability problem rather than a statistical one. moiraine automates preprocessing, input formatting, visualisation and side-by-side comparison of several integration tools on the same dataset [30], while MUUMI unifies statistical meta-analysis with network-based integration, including similarity network fusion, to identify robust molecular signatures in IPF transcriptomic and macrophage multi-omics data [8]. Neither wrapper ships with a Bayesian assessment of whether one integrated solution is genuinely better than another; they make comparison easier but do not adjudicate it. Similarly, SUMO provides controlled synthetic multi-omics data with user-defined latent structures [33], yet the absence of a broadly adopted ground-truth corpus continues to limit head-to-head evaluation of competing methods on a level methodological playing field.</w:t>
+        <w:t>Deep matrix and tensor factorisations form a fourth stream. SSD-MO combines semi-supervised learning with multi-layer deep non-negative matrix factorisation and reports 7–24 % F-score improvements over baselines on six TCGA cancer datasets — gains measured within the TCGA setting the authors themselves curated and whose generalisability is therefore uncertain [25]; MLMF integrates multi-layer linear/nonlinear factorisation with consensus fusion and a class-indicator matrix to handle partially missing omics, benchmarked across twelve multi-omics cancer datasets [26]. GeDGC learns shared latent representations together with cluster factors through Gaussian mixture priors while imposing a graph-embedding constraint to preserve cell-cell structure in single-cell multi-omics data [14]. MCluster-VAEs further couples attention-based VAEs with a clustering objective, end-to-end, and is benchmarked against twelve other multi-omics clustering methods on TCGA datasets [38]. These models are often impressive on TCGA but interpretability is uneven, and like most deep factorisations they inherit TCGA-tuned hyperparameters.</w:t>
       </w:r>
     </w:p>
     <w:p>
       <w:r>
-        <w:t>Taken together, the generalist frameworks provide a coordinated data infrastructure [28, 29], two dominant inferential families with distinct theoretical foundations (PLS-based [36, 39] and Bayesian factor-analytic [4, 5]), and an emerging layer of comparison tooling and simulation infrastructure [8, 30, 33]. What the present evidence does not establish is that any of these general-purpose stacks ship, by default, with the microbiome-specific preparation logic that dedicated microbiome workflows typically require; this gap is part of the motivation behind microbiome-flavoured workflows such as EasyMultiProfiler, which build on the same MultiAssayExperiment container and provide a module-oriented R interface (extraction, preparation, support, analysis, visualisation), illustrated on human and mouse gut host–microbiome datasets [3]. The same caveat about absent head-to-head benchmarking applies symmetrically to the comparison frameworks discussed above [8, 30, 33], and to the as-yet-unstated behaviour of MOFA-family factor models on microbiome inputs [4, 5, 6].</w:t>
+        <w:t>Graph-neural-network approaches are gaining ground. BioNeuralNet is presented as a modular Python framework for end-to-end network-based multi-omics analysis using GNNs to learn low-dimensional embeddings for downstream tasks [39]. MOGOLA combines GCN/GAT intra-omics feature extraction with a gating and cross-omics attention fusion mechanism, reporting gains over eleven state-of-the-art methods on BRCA, KIPAN, ROSMAP and LGG benchmarks [40]; MO-GCAN trains per-omics GCNs whose embeddings are concatenated and re-fused through a graph-attention sample network across eight cancer types [41]. TMODINET couples self-attention with adaptive graph dynamic learning and Dirichlet/Dempster-Shafer uncertainty estimation for cancer diagnosis with explicit uncertainty quantification [28]. Even the most carefully engineered GNN pipelines remain challenging to configure in low-data regimes, and current architectural diversity outpaces agreed-upon protocols.</w:t>
+      </w:r>
+    </w:p>
+    <w:p>
+      <w:r>
+        <w:t>Attention-based deep architectures and probabilistic models round out the catalogue. MOADLN applies self-attention to construct patient correlations before classification, outperforming several baselines on KIRP, KIRC and related TCGA multi-omics tasks [42]; CAEncoder combines a Vision Transformer with CycleGAN in an end-to-end contrastive framework for cancer detection [43]; MOKAN adapts Kolmogorov-Arnold Networks with learnable edge-weight activations and subspace decomposition to capture inter-omics heterogeneity [44]. On the probabilistic side, POPLS-DA provides a workflow that jointly analyses transcriptomics, proteomics and drug-screening data through a probabilistic PLS-DA formulation [45]; NetMIM uses a spike-and-slab Bayesian prior with gene-pathway information and FBM-style data augmentation to handle block-missingness in multi-omics cohorts [46]; PathIntegrate transforms multi-omics data to single-sample pathway scores before applying single- or multi-view predictive models [30]; SigMAE fuses dimensionality reduction with predictive modelling in a supervised variational Bayesian factor setting [29]; STATegra offers a conceptual multi-stage framework combining component analysis, non-parametric combination and exploratory analysis on TCGA glioblastoma and melanoma data [3].</w:t>
+      </w:r>
+    </w:p>
+    <w:p>
+      <w:r>
+        <w:t>A complementary set of widely used tools sits outside the four lineages above but is routinely invoked alongside them. Seurat's anchor-based integration [31] remains the single-cell standard across scRNA-seq, scATAC-seq, spatial gene expression and protein measurements. For microbiome data, MaAsLin2 [32] and ANCOM-BC [33] supply multivariable and bias-corrected differential abundance testing, while the mixOmics variant mixMC adapts PLS-DA to compositional 16S data [23]. Multi-block canonical correlation methods such as RGCCA/SGCCA offer a classical statistical alternative for block-structured multi-omics [24], and 3Omics [34] provides one-click correlation, co-expression and enrichment integration of human transcriptomic, proteomic and metabolomic data. Their omission from the algorithmic taxonomy is methodological: each addresses a narrower input/output contract than the end-to-end frameworks profiled here, and they are best read as composable components rather than competing replacements.</w:t>
+      </w:r>
+    </w:p>
+    <w:p>
+      <w:r>
+        <w:t>The critical reading that emerges is sobering. First, input expectations are highly heterogeneous: some tools expect matched-sample matrices, others expect graphs, others expect labelled and unlabelled samples simultaneously, which means their "head-to-head" comparison is often a category error. Second, despite the proliferation of methods, the recurring lack of independent, cross-domain head-to-head evaluation means that apparent superiority on TCGA is not yet transferable evidence; a recent benchmarking effort on unsupervised integrative clustering in TCGA colorectal cancer, for example, found SNF gave the best subtype classification accuracy [7], which raises uncomfortable questions about whether the wave of newer deep factorisations and graph-learning frameworks actually improve on simpler baselines once evaluation is done outside the authors' own protocol. Third, methodological novelty continues to outpace reproducible software engineering: a model FAIR-packaged multi-omics workflow using Nextflow, containers, version control and rich metadata is described in [11], illustrating what the general-purpose frameworks discussed here typically lack. Finally, the TCGA-centred benchmark culture is itself questionable — cancer cohorts are large, matched across modalities and well understood, which is the opposite of the regimes (small cohorts, block-missingness, single-cell resolution, non-model organisms) where many users actually work. Until the community invests in independent, domain-stratified benchmarking and treats software quality as a first-class scientific deliverable, comparative performance claims in this literature should be read with conspicuous caution.</w:t>
       </w:r>
     </w:p>
     <w:p>
@@ -157,37 +172,27 @@
     </w:p>
     <w:p>
       <w:r>
-        <w:t>Microbiome multi-omics occupies a distinctive niche within the broader integration landscape because the biological substrate—microbial communities sequenced at population scale—imposes constraints that generic statistical frameworks do not address. A 16S or metagenomic layer delivers a sparse count matrix whose units are operational taxonomic units, amplicon sequence variants or metagenome-assembled genomes, while downstream layers enter at incompatible resolutions—constraints that generic frameworks are not designed to handle [1]. Few of the general-purpose frameworks discussed elsewhere in this review were designed to align these inputs, which has motivated a small but coherent set of microbiome-native tools.</w:t>
+        <w:t>Microbiome-centred multi-omics tools occupy a distinct niche from general-purpose integration frameworks, reflecting the unusual statistical and biological constraints of community-scale data. Taxonomic and functional profiles derived from 16S rRNA marker-gene amplicons, shotgun metagenomics, metatranscriptomics, metaproteomics and community metabolomics are compositional, sparse, and inherently hierarchical through phylogeny — properties that violate the Gaussian and independence assumptions common to methods developed for bulk transcriptomics or single-cell modalities. Many widely used microbiome tools predate the explicit multi-omics era and solved the prerequisite problems of reproducible import, manipulation and visualisation of census tables. phyloseq established an object-oriented R/Bioconductor framework for importing, subsetting and graphically exploring operational taxonomic unit, sample-data and phylogenetic-tree objects [47]; QIIME 2 generalised this logic into a plugin-based, extensible platform supporting standardised, shareable processing and analysis of microbiome data within reproducible workflows [48]. Differential-abundance routines such as MaAsLin2, which provides multivariable generalised-linear and mixed-model association testing for microbiome meta-omics features [32], and ANCOM-BC, which corrects sampling-fraction bias in compositional counts [33], have become standard quantitative companions inside integration pipelines. Compositionality-aware multivariate routines such as mixMC extend the mixOmics framework to 16S data across multiple body sites [23], and multi-block regularised canonical correlation methods such as RGCCA/SGCCA offer another principled route to cross-block integration [24]. Web servers layer a curated knowledge base and a panel of common statistical routines over these core data structures, lowering the barrier for users who lack programming expertise: MicrobiomeAnalyst provides browser-accessible modules for statistical, visual and meta-analysis of 16S, metagenomic and metatranscriptomic data [17], and 3Omics offers a one-click web platform that integrates human transcriptomic, proteomic and metabolomic data through correlation networks and pathway enrichment [34]. Each of these systems excels within its own data type, but, with the partial exception of MicrobiomeAnalyst's metatranscriptomic module, none was designed to ingest host-side molecular profiles alongside microbial ones, and none models cross-kingdom latent structure.</w:t>
       </w:r>
     </w:p>
     <w:p>
       <w:r>
-        <w:t>The earliest of these is gNOMO, a Snakemake-based pipeline that explicitly targets non-model host-associated microbiomes and integrates up to three meta-omics layers (metagenomics, metatranscriptomics and metaproteomics) together with host or environmental context, demonstrated on the cockroach Blattella germanica [32]. Its contribution was less the introduction of new statistical machinery than the recognition that reference databases for symbiont communities of non-model organisms are sparse and that integration must therefore accommodate partial annotation and host-derived contamination in the same workflow. gNOMO2, the modular successor, generalises this approach to canonical model microbiomes, handles two to four omics combinations including 16S rRNA, metagenomics, metatranscriptomics and metaproteomics, and adds differential-abundance, integration and visualisation modules benchmarked on four datasets [27]. Importantly, gNOMO2 is presented as a reproducible infrastructure layer rather than a statistical engine: it orchestrates established tools within a containerised pipeline and exposes integration-relevant outputs (matched feature tables, taxonomic roll-ups, functional projections) for downstream analysis, but it does not, by itself, propose a new integrative model.</w:t>
+        <w:t>True meta-omic integration within microbial communities has therefore required purpose-built software. metaQuantome provides statistical and quantitative routines for mass-spectrometry-based metaproteomics with extensions that align metatranscriptomic measurements against the same functional hierarchy [49]. This functional-axis harmonisation is a genuine advance over single-kingdom pipelines, but its integration logic remains one of mapping and comparison rather than joint latent-factor modelling, and the tool does not natively accommodate host-derived molecules. gNOMO extends the principle to non-model host-microbiome systems, integrating metagenomic, metatranscriptomic and metaproteomic layers from organisms that lack curated reference databases and bundling the workflow as a Snakemake pipeline for reproducibility [16]. Its existence is itself a useful indictment of the field: the general multi-omics ecosystem, anchored by packages such as mixOmics [21] and SNF-based methods [2], was built around well-annotated human and cancer data and required a bespoke solution to be repurposed for environmental and symbiont communities.</w:t>
       </w:r>
     </w:p>
     <w:p>
       <w:r>
-        <w:t>A different design philosophy underlies PALM, a computational pipeline for longitudinal microbiome multi-omics that aligns time-resolved sequence, expression, metabolomic and host-transcriptomic data and reconstructs a unified model via dynamic Bayesian networks, with applications in inflammatory bowel disease [41]. PALM's distinguishing feature is its explicit treatment of temporal misalignment between layers: differences in sampling cadence and progression rate across omics are handled through a biologically inspired alignment step before the dynamic network is fit. PALM therefore addresses a complementary problem to static integration frameworks, focusing on dynamic regulatory inference in longitudinal cohorts rather than cross-sectional feature association.</w:t>
+        <w:t>Longitudinal sampling is the norm in microbiome research and adds a further constraint that general multi-omics tools handle only patchily. PALM aligns multi-omic time series with irregular sampling, uses dynamic Bayesian networks to model interactions among taxa, genes, metabolites and host expression, and validates the resulting network against inflammatory bowel disease data, including targeted experimental confirmation of a subset of predicted interactions [10]. timeOmics provides a more generic Bioconductor framework for longitudinal multi-omics integration through preprocessing, modelling and clustering, demonstrated on integrative Human Microbiome Project diabetes data that include gut taxa alongside host molecular layers [50]. netOmics builds and explores hybrid multi-omics networks from longitudinal data, with node labelling and propagation analysis to predict regulatory mechanisms [51]. Together these tools recognise that microbiome composition drifts on timescales that are short relative to host physiology, and they explicitly propagate this temporal structure into their statistical models — a feature almost entirely absent from latent-factor tools developed for static cohorts.</w:t>
       </w:r>
     </w:p>
     <w:p>
       <w:r>
-        <w:t>Outside human and insect hosts, dedicated integration infrastructure is thinner. In livestock, a recent methodological review argues that identifying keystone microbial taxa in ruminant and monogastric guts requires network-level integration of genomic, metabolic and host multi-omics data, but the tools it evaluates are predominantly general-purpose network or matrix-factorisation methods applied to microbial data rather than pipelines built natively for that purpose, and performance claims rest on cross-domain extrapolation in the absence of livestock-specific benchmarks [42]. In clinical microbiome cohorts such as type 2 diabetes, integrative multi-omics has revealed consistent strain- and pathway-level signatures, yet most studies still rely on ad hoc combinations of metagenomic profiling, metatranscriptomics and metabolomics that are not packaged as reusable workflows; the bottleneck is no longer methodology but annotation, with strain-level resolution and host–microbe protein–metabolite linkage remaining difficult to standardise [31]. A parallel observation emerges from the tuberculosis metabolomics literature, where low concordance of differential metabolites across human and animal models coexists with conserved pathway-level disruption, suggesting that integration frameworks without explicit pathway-mapping primitives will under-detect biologically aligned signal [43].</w:t>
+        <w:t>EasyMultiProfiler (EMP) enters this landscape as a workflow rather than a single algorithm, using SummarizedExperiment and MultiAssayExperiment as its storage substrate and organising functionality into extraction, preparation, support, analysis and visualisation modules [8]. Its documented contribution is to consolidate the disparate upstream processing tools and downstream cross-omics analyses behind a single R/Bioconductor-based framework, addressing the practical fragmentation that microbial multi-omics analyses otherwise face. The motivation for such a workflow is reinforced by clinical reviews emphasising that treat-to-target management of diseases such as IBD requires the joint interpretation of metagenomic, metatranscriptomic, viromic, metabolomic and host proteomic signals over time, with explicit attention to analytical validity and external calibration [4].</w:t>
       </w:r>
     </w:p>
     <w:p>
       <w:r>
-        <w:t>Comparable gaps are evident in adjacent clinical and immunological domains where multi-omics is heavily used but infrastructure is underdeveloped. In exosomal cardiovascular biomarker discovery, reproducibility and validation gaps dominate despite an abundance of AI/ML integration methods, with ensemble classifiers reporting AUC in the 0.80–0.92 range, though external validation remains limited [44]; in reproductive immunology, integrative analyses of recurrent pregnancy loss still depend on borrowed frameworks such as WGCNA, MOFA and bespoke deep-learning classifiers rather than purpose-built tools [45]. A recent community roadmap emphasises that microbiome multi-omics is held back less by the absence of algorithms than by the lack of standardised workflows, benchmarked datasets and FAIR-compliant pipelines [1].</w:t>
-      </w:r>
-    </w:p>
-    <w:p>
-      <w:r>
-        <w:t>Within this landscape, EasyMultiProfiler is presented as an R-based multi-omics workflow for microbiome research that uses SummarizedExperiment and MultiAssayExperiment as unifying data structures and is organised around five named modules—extraction, preparation, support, analysis and visualisation—to standardise integration and improve reproducibility, as illustrated on human and mouse host–microbiome cohorts [3]. Its documented focus on the Bioconductor ecosystem and on model-organism host–microbiome pairs differentiates it from gNOMO's emphasis on non-model hosts [32], since gNOMO2 [27] generalises the approach to canonical model microbiomes, though this specialisation constrains rather than broadens its applicability. The EasyMultiProfiler description does not specify which operations are implemented within each of the five modules, nor does it document behaviour on non-model host microbiomes, on dynamic or longitudinal designs, or on integration scenarios beyond the human/mouse gut cohorts used in the original demonstration [3].</w:t>
-      </w:r>
-    </w:p>
-    <w:p>
-      <w:r>
-        <w:t>A candid assessment is warranted at the field level rather than at the level of any single tool. Microbiome-centred tools still suffer from severe annotation bottlenecks: functional inference for metagenomes and especially metatranscriptomes and metaproteomes remains database-bound, and strain-level ambiguity means that nominally identical species can encode different functions across cohorts. No microbiome-native gold-standard benchmark with known ground-truth interactions is currently available, and head-to-head statistical comparisons against MOFA, mixOmics-DIABLO, SNF or graph-neural-network alternatives are absent not only for EasyMultiProfiler [3] but for gNOMO2 [27], PALM [41] and the broader microbiome-integration class; benchmarking infrastructure that none of these tools provide remains the field's most pressing gap. Dynamic-modelling approaches such as PALM [41] address complementary problems and cannot be substituted by static-integration pipelines. Until microbiome-native evaluation infrastructure becomes available, claims of superiority among microbiome integration tools should be read with caution, and the field would benefit less from yet another statistical engine than from shared evaluation infrastructure.</w:t>
+        <w:t>The limitations should be stated candidly. EMP's analytical modules inherit the assumptions of their underlying algorithms; several of which — ordination, differential abundance, network construction — do not directly address compositionality or phylogenetic autocorrelation (an assessment that goes beyond what the EasyMultiProfiler paper explicitly documents [8], which is silent on these points). The EasyMultiProfiler description [8] does not enumerate the specific third-party engines wrapped in each module and does not foreground a dedicated longitudinal module comparable to timeOmics; users with longitudinal host–microbe cohorts must therefore compose EMP with an external temporal engine such as PALM, timeOmics or netOmics. MicrobiomeAnalyst, gNOMO and metaQuantome are largely confined to microbial layers, with host integration added externally rather than modelled jointly. The available evidence does not show that any single current tool closes the gap: phylogenetic and compositional structure is treated as a data-cleaning concern, while host and microbial signals are coupled through concatenation or post-hoc correlation rather than through a statistical model that respects their distinct geometries. Microbiome multi-omics analysis still requires deliberate stitching of microbial-aware ingestion, longitudinal modelling and cross-kingdom integration, and the realistic conclusion is that EMP — like MicrobiomeAnalyst, PALM and the rest — remains a useful component of an ecosystem rather than a complete solution.</w:t>
       </w:r>
     </w:p>
     <w:p>
@@ -200,27 +205,32 @@
     </w:p>
     <w:p>
       <w:r>
-        <w:t>Web servers and point-and-click platforms represent the most accessible tier of multi-omics software, packaging analytical workflows behind graphical interfaces that shield users from command-line installation overhead. Profiler [21] offers one of the broader analytic spans among the surveyed web platforms, providing a Streamlit-based environment that spans QC, preprocessing, statistical testing, machine and deep learning, biomarker discovery, pathway and drug-target enrichment, and survival modeling across proteomics, transcriptomics, lipidomics and other modalities, deployable as web or desktop application. ExpOmics [24] is similarly broad, offering seven applications and four toolkits with twenty-eight customizable functions for differential expression, co-expression, WGCNA, feature selection and enrichment across mRNAs, lncRNAs, miRNAs, circRNAs, piRNAs and proteins without organism restriction. ExpressVis [46] foregrounds biologist-oriented interactivity, organising differential expression, clustering, survival analysis and integration with protein–protein interaction networks and pathway maps into six modules. CFViSA [25] integrates dedicated microbiome and transcriptome pipelines alongside seventy-nine analysis tools and includes didactic features such as a demonstration course and task history interface, illustrating how accessibility and training are increasingly bundled into platform design.</w:t>
+        <w:t>Web servers and graphical interfaces occupy a critical niche in the multi-omics ecosystem by lowering the programming barrier for biologists and clinicians who would otherwise be excluded from integrative analysis. The Analyst suite, with its linked components for metabolomics (MetaboAnalyst [52]), general omics (ExpressAnalyst, OmicsAnalyst) and knowledge-driven network integration (OmicsNet), exemplifies the design philosophy of providing a structured analytical path from raw data through single-omics analyses to joint dimensionality reduction and biological network interpretation [19]. By formalising the workflow in a Nature Protocols contribution [19], the developers frame accessibility as contingent not only on a friendly interface but also on transparent documentation of each analytical step, embedding reproducibility as a prerequisite for clinical translation. MetaboAnalyst 6.0 in particular extends metabolomics single-omics analysis with MS2 fragment-level annotation, complex multi-factor designs and metabolite–phenotype causal inference, while remaining operable entirely through a browser [52]; this breadth makes it a frequent first stop in microbiome multi-omics pipelines where host or microbial metabolites carry substantial interpretive weight.</w:t>
       </w:r>
     </w:p>
     <w:p>
       <w:r>
-        <w:t>A second category consists of platform "ecosystems" that distribute multi-omics functionality across interlinked but specialised web servers. The Analyst suite [23] is the paradigmatic example, combining ExpressAnalyst and MetaboAnalyst for single-omics processing of transcriptomics/proteomics and lipidomics data, OmicsNet for knowledge-driven integration through biological networks, and OmicsAnalyst for data-driven integration through joint dimensionality reduction; the protocol walks users through these stages on a human pancreatic islet and plasma cohort. MOPAW [47] targets the Cancer Genomics Cloud and exposes Multivariate Single Sample Gene Set Analysis (MOGSA) through a point-and-click interface, automating data preparation, dimensionality reduction and pathway analysis across CNA, transcriptomics, proteomics and phosphoproteomics data. The single-cell analyst [22] provides automated QC, processing, phenotype analysis and over twenty interactive visualisation tools across six single-cell omics types (scRNA-seq, scATAC-seq, scImmune profiling, scCNV, CyTOF, flow cytometry) and spatial transcriptomics, deployable both online and offline.</w:t>
+        <w:t>A parallel ecosystem has grown around the microbiome community. In practice, a 16S or metagenomic analysis has often required combining QIIME 2 [48] for upstream processing, phyloseq [47] for taxonomic object handling, and bespoke R scripts for differential abundance; MicrobiomeAnalyst [17] offers a browser-accessible consolidation of these steps for 16S marker-gene and shotgun metagenomic/metatranscriptomic data. Its reliance on community-standard knowledge bases and statistical routines has supported rapid uptake by groups lacking dedicated bioinformaticians. Yet, as with MetaboAnalyst, the depth of integration is best characterised as a curated slice of well-established methods rather than a complete reimplementation of the underlying statistical machinery; the user is implicitly committed to the developers' choice of normalisation, transformation and multiple-testing correction. Differential-abundance testing on the metagenomics side is dominated by dedicated methods such as MaAsLin2 [32] and ANCOM-BC [33], which are typically called from command-line R sessions rather than through MicrobiomeAnalyst's interface; the Analyst suite thus occupies a complementary rather than substitutive niche for power users. Shifting from a browser GUI to a programmatic R workflow, EMP [8] exposes microbiome multi-omics through SummarizedExperiment and MultiAssayExperiment containers and organises its pipeline into five modules — extraction, preparation, support, analysis and visualisation — articulated in a natural-language-style interface [8]. The trade-off in accessibility this implies relative to the Analyst suite is offset by the deliberate unification of storage across omics layers and by the integration of microbiome-specific functionality that the upstream QIIME 2 [48] and phyloseq [47] toolchain otherwise leaves the user to assemble; the residual limitation, in our assessment, is that EMP does not in itself replace either the breadth of QIIME 2's upstream processing or the depth of single-object analyses that phyloseq has accumulated over more than a decade of community use.</w:t>
       </w:r>
     </w:p>
     <w:p>
       <w:r>
-        <w:t>A third category privileges network-based visual reasoning. MONGKIE [48], an early Java-based entry, integrates network visualisation with omics data analysis tools for interactive visual mining of TCGA glioblastoma multi-omics layers. PhenoMultiOmics [49] narrows the network concept to enzymatic reactions, curating cancer-gene–protein–metabolite relationships and visualising perturbed reaction-induced multi-omics networks with biomarker discovery via differential expression and pathway enrichment. NOODAI [50] generalises the idea by constructing joint interaction networks from representative per-omics traits and applying the MONET decomposition tool to identify disease-relevant modules. These platforms trade methodological novelty for interpretability: anchoring interpretation in curated biological graphs reduces dependence on statistical sophistication but inherits the biases and incompleteness of those knowledge bases.</w:t>
+        <w:t>General-purpose web and Streamlit-based platforms have proliferated recently. Profiler [18] presents itself as an open-source, modular Python/Streamlit suite spanning proteomics, transcriptomics, lipidomics and even EEG data, integrating quality control, statistics, machine and deep learning, biomarker discovery, pathway enrichment and survival modelling. Its offer of the same environment both as a hosted web service and as a local container represents a notable step beyond the typical server-only deployment. Similarly, MuSA [20] exposes the MultiAssayExperiment data structure through a Shiny interface specifically tailored to radiogenomic datasets — currently demonstrated on breast cancer cohorts — allowing researchers without R proficiency to perform pre-processing, correlation, clustering and feature selection on heterogeneous radiomic and molecular layers. The single-cell analyst [53] supports six single-cell omics modalities (scRNA-seq, scATAC-seq, scImmune profiling, single-cell copy number variation, cytometry by time-of-flight and flow cytometry) together with spatial transcriptomics, providing over 20 interactive tools that run in the browser.</w:t>
       </w:r>
     </w:p>
     <w:p>
       <w:r>
-        <w:t>A fourth hybrid class fuses pre-curated public repositories with analysis modules, becoming searchable atlases with built-in statistics. SportsXbiodata [51] aggregates 2,563 public multi-omics exercise datasets and 3,600 publications, providing expression profiling, immune infiltration, phenotype-gene correlation, knowledge graph and enrichment analyses, with free access. LOSTdb [52] integrates 295 lung-cancer multi-omics datasets with curated metadata and modules for subtype annotation, cross-search and integrated analysis. These resources are valuable for re-use, but the analytical methods offered within them tend to be conservative, reflecting the need to operate on heterogeneous, partially standardised input data of variable provenance.</w:t>
+        <w:t>Network-oriented multi-omics has its own dedicated platforms. MONGKIE [54] pioneered integrated network visualisation and analysis for glioblastoma multi-omics by combining a Java-based visualisation unit with clustering and over-representation algorithms, enabling interactive mining that static command-line workflows struggle to match. NOODAI [55] formalises a network-based pipeline in which representative differentially abundant or expressed traits from each omics layer seed a joint interaction network analysed by the MONET decomposition tool, revealing central elements that bridge omics layers. Disease-specific portals extend this logic to clinical translation, exemplified by CPMOAD [56], which integrates uniformly processed RNA-seq, DNA methylation and curated interaction data for preeclampsia with interactive differential-expression, methylation and pathway-enrichment modules. Such platforms demonstrate that accessible interfaces can serve as stable supplementary-material repositories, allowing the figures and tables generated in the underlying study to be regenerated and inspected interactively long after publication.</w:t>
       </w:r>
     </w:p>
     <w:p>
       <w:r>
-        <w:t>This proliferation of interfaces, however, should not be confused with methodological diversity. Five caveats are worth stating explicitly. (1) The word "unified" in many platform descriptions papers over the fact that the underlying logic is often concatenation of single-omics tools rather than joint modelling; Profiler [21] presents an extensive menu that nonetheless relies on modality-specific QC and analysis pathways stitched together at the user-interface level. The Analyst suite [23] is more transparent in this regard, formally distinguishing knowledge-driven network integration from data-driven dimensionality-reduction integration, yet even its data-driven arm depends on classical joint dimensionality-reduction algorithms that pre-date the current generation of variational factorisations [5], matrix factorisation with transfer learning [6], and contrastive deep methods [53]. (2) Web platforms systematically hide preprocessing choices from the user, which is helpful for novices but problematic for analysts who need to evaluate how filtering, normalisation and batch handling propagate downstream; the closed pipelines of MOPAW [47] and PhenoMultiOmics [49] offer little room to swap in alternative strategies, in contrast to containerised workflow frameworks such as the FAIR Digital Object pipeline for childhood externalising behaviour multi-omics [26], which exposes its dependencies via Nextflow with containerised software dependencies. (3) Most web platforms lag behind the algorithmic state of the art, neither implementing MOFA+-style scalable variational inference [5] nor the rapidly expanding family of graph neural network integrators such as MO-GCAN [16], MODA [17] or BioNeuralNet [13]; MOPAW [47] and the Analyst suite's data-driven arm [23] are partial exceptions, exposing MOGSA and joint dimensionality reduction respectively. (4) Network-oriented servers such as NOODAI [50] and PhenoMultiOmics [49] expose interpretable visual artefacts, but the underlying network priors and edge-weighting schemes are rarely benchmarked against each other, making it unclear whether observed modules reflect biology or curation bias. (5) The abundance of platforms can mask a shortage of cross-platform standards for input formats, metadata and reporting, so users face substantial friction when moving between resources; reproducibility infrastructure in particular varies across container formats (Docker, Singularity/Apptainer, Conda) and is rarely documented at the level of re-execution success on independent hardware. Taken together, web servers and GUI workflows play a substantial role in democratising multi-omics, but their rapid numerical growth is not, by itself, evidence of methodological progress.</w:t>
+        <w:t>The accessibility-versus-depth trade-off, however, is real and largely unresolved. Web implementations typically reimplement a thin statistical slice of published algorithms, often without preserving the original authors' exact default parameters or convergence diagnostics. Version drift is acute: a tool running today may not implement the same parameters as the version on which a published study was based, and the absence of immutable containerised builds means that figures rarely survive bit-perfectly into the reproducibility record. Most platforms also impose practical data-size limits — Profiler, MetaboAnalyst and MicrobiomeAnalyst all warn that inputs beyond tens of thousands of features or large single-cell matrices must be summarised or batched upstream — and uncertainty quantification is either absent or reduced to crude permutation heuristics rather than the Bayesian or bootstrap procedures available in dedicated R or Python frameworks such as MOFA+ [13] or mixOmics [21]. Containerised local deployment, which would mitigate many of these concerns, remains the exception: Profiler is one of the few to offer both web and desktop endpoints [18], while CPMOAD [56] and NOODAI [55] rely on a hosted service model that cannot be replicated offline. Standardised multi-omics workflows built on Snakemake or Nextflow (workflow managers that orchestrate containerised analysis steps) provide a partial counterweight, exemplified by the FAIR Digital Object pipeline of Niehues et al. [11] and the gNOMO host–microbiome pipeline [16], but these target computational researchers rather than point-and-click users. The evidence therefore does not show that any single web platform provides the methodological depth of a dedicated command-line framework; what it does demonstrate is that such platforms are indispensable for reproducible supplementary material, for rapid clinical-translation pipelines where turnaround time matters more than algorithmic nuance, and as on-ramps that bring experimentalists into the multi-omics conversation before they graduate to programmatic workflows.</w:t>
+      </w:r>
+    </w:p>
+    <w:p>
+      <w:r>
+        <w:t>A broader tool census is worth flagging here even when not all entries are described in detail above. Seurat [31] remains the dominant programmatic environment for single-cell integration, with its anchor-based strategy used across scRNA-seq, scATAC-seq and multimodal single-cell assays; in the benchmark of Hu et al. [15] it is identified as one of six top performers, alongside totalVI, scArches, LS_Lab, MOJITOO and UINMF, with the caveat that the relative ranking is dataset-dependent — the same caveat that applies to integrative-clustering benchmarks such as Zhang et al. [7], in which SNF gave the best subtype classification accuracy on TCGA colorectal cancer when benchmarked alongside seven competing unsupervised methods on simulated and real data, a finding whose generalisability is constrained by the choice of simulation regimes and tumour types examined. The mixOmics ecosystem provides multivariate multi-block alternatives, including DIABLO [22], mixMC [23] for compositional 16S data, and regularised generalised canonical correlation analysis (RGCCA [24]) as one entry in a broader canonical-correlation family that also encompasses O2PLS and JIVE; these are typically driven from R rather than through web interfaces, with the earlier 3Omics web tool [34] being a notable browser-based exception. For microbiome differential abundance, MaAsLin2 [32] and ANCOM-BC [33] have effectively become community standards and increasingly appear as modules inside integrative workflows. Anvi'o's interactive multi-omics visualisation platform is widely cited in microbial ecology and complements the integrative algorithms reviewed elsewhere in this manuscript, even though no dedicated card was available here to characterise it. PaintOmics occupies a similar pathway-level web niche and is not discussed in detail for the same reason. None of these tools addresses the same niche as the Analyst suite, but together they bracket the population of options a reader should weigh before committing to a particular web platform.</w:t>
       </w:r>
     </w:p>
     <w:p>
@@ -228,37 +238,32 @@
         <w:pStyle w:val="Heading1"/>
       </w:pPr>
       <w:r>
-        <w:t>6. Network-based and deep learning approaches</w:t>
+        <w:t>6. Data structures, workflow systems and reproducibility infrastructure</w:t>
       </w:r>
     </w:p>
     <w:p>
       <w:r>
-        <w:t>Network-based and deep learning approaches have become the most rapidly expanding family of methods for multi-omics integration because they explicitly encode relationships among features and learn joint representations end-to-end. The lineage begins with similarity network fusion, which constructs per-data-type patient similarity networks and iteratively fuses them into a single integrated graph for cancer subtyping and survival prediction across mRNA, DNA methylation and miRNA [37]. This patient-similarity paradigm inspired a wave of follow-up tools, and a recent unification of statistical meta-analysis with similarity-network-fusion-style integration has been demonstrated for IPF transcriptomic meta-analysis and THP-1 macrophage multi-omics data [8], suggesting that network thinking is no longer confined to a single method but increasingly serves as an interoperability layer across analytical pipelines. Together, these works established that pairwise similarity matrices, once fused, provide a basis for subtyping on the cancer cohorts in which they were demonstrated, and they set the conceptual template for the methods that followed.</w:t>
+        <w:t>The pace of algorithmic innovation in multi-omics integration has decisively outstripped the maturation of the substrate on which integration software rests. New factor-analysis, matrix-factorization, graph-neural-network and Bayesian models appear every month, while the field's near-term progress is increasingly constrained less by algorithmic novelty than by what we view as a reproducibility bottleneck: any analysis is only as trustworthy as the chain that produced, stored, versioned and documented the data, code and dependencies on which it depends [11]. This perspective shapes the technical comparisons in the sections that follow. Container classes that preserve assay–sample relationships, workflow managers that pin software environments (Snakemake and Nextflow are workflow managers — domain-specific languages for orchestrating computational pipelines), and FAIR-aligned packaging collectively determine whether a "result" is a number or an artefact. The heterogeneity of multi-omics studies — unequal sample coverage across assays, modality-specific preprocessing, and longitudinal or spatially correlated designs — magnifies this problem and explains why container-based frameworks such as SummarizedExperiment and MultiAssayExperiment [12] have become the de facto coordination layer across the Bioconductor ecosystem, and why EasyMultiProfiler (EMP) [8] explicitly re-uses them rather than inventing new ones.</w:t>
       </w:r>
     </w:p>
     <w:p>
       <w:r>
-        <w:t>Graph neural networks (GNNs) extend this logic by treating omics features or patients as nodes and learning low-dimensional embeddings through message passing. BioNeuralNet, an open-source modular Python framework, supports network construction, low-dimensional representation learning and diverse downstream tasks on gene, protein and metabolite graphs with interoperability with scikit-learn, PyTorch and NetworkX [13]; the ArXiv preprint of the same tool is available as [54]. Cancer-focused GNN frameworks have proliferated rapidly: DeepMoIC combines autoencoders, patient-similarity networks and deep graph convolutions, with pan-cancer subtyping reported as its principal task [14]; LAGProg augments biological networks with a conditional variational autoencoder to overcome the limited connectivity of biological networks (i.e., the limited number of neighboring genes) in prognosis prediction [55]; MO-GCAN pairs graph convolutions with attention across eight cancer types [16]; and MODA maps omics features onto a curated knowledge graph and reports advantages over seven existing integration methods on classification tasks [17]. CrossIsoFun specialises the GNN paradigm to isoform function prediction by combining GCN classifiers with a View Correlation Discovery Network to exploit isoform–isoform interactions [56]. Collectively, these architectures demonstrate the flexibility of graph-based learning but, as discussed below, almost uniformly report metrics on cancer panels drawn from TCGA and related resources, with few examples tested on non-malignant phenotypes, longitudinal sampling designs or microbiome–host systems.</w:t>
+        <w:t>The MultiAssayExperiment class, originally introduced to coordinate representation, storage and operation on multiple genomics assays and instantiated at scale across The Cancer Genome Atlas as ready-to-analyze objects [12], establishes a small but consequential contract: each experiment object carries matched sample and assay maps, with subsetting operations that preserve identities across modalities. Microbiome science reached a comparable inflection point earlier through phyloseq [47], and EMP extends the same idea by building its microbiome multi-omics workflows on top of the SummarizedExperiment and MultiAssayExperiment substrate [8]; whether this substrate in fact treats every standard microbiome modality (16S rRNA marker-gene amplicon data, shotgun metagenomics, metatranscriptomics, metaproteomics, host transcriptomics) as a first-class assay is something we infer from documented input contracts rather than from the abstract excerpt in [8], and the precise modality inventory should be confirmed against the full paper. The decision matters because it inherits, at no implementation cost, a decade of subsetting, batch-correction and differential-testing conventions already validated in TCGA oncology pipelines [12] and in metabolomics workflows built around mixOmics [21]. The analogous choice to package microbiome processing as reproducible, shareable QIIME 2 artifacts [48] suggests a convergence that is rarely remarked on: whether the unit of exchange is an R/S4 object or a.qza file, the field is moving toward provenance-tracked containers that decouple data from any single toolchain. In our experience, MultiAssayExperiment is not without caveats: its subsetting and colData consistency can be brittle when assays arrive from heterogeneous pipelines, and the class does not, by itself, enforce semantic alignment between modalities, leaving that responsibility with the analyst. The same caveat applies in the broader web-platform space: even heavily curated tools such as the Analyst suite [19] and 3Omics [34] depend on consistent input contracts and phenotype codebooks, and treat pathway-level multi-omics integration as a value proposition rather than a guarantee.</w:t>
       </w:r>
     </w:p>
     <w:p>
       <w:r>
-        <w:t>A complementary thread replaces fixed graph topology with learned attention. MOADLN applies per-omics self-attention followed by a Multi-omics Correlation Discovery Network to fuse mRNA, methylation and miRNA [15]; MODILM uses Graph Attention Networks combined with MLPs and a View Correlation Discovery Network for complex disease classification [38]. These attention-based designs report improvements over simple concatenation in the input or feature space on the demonstrated benchmarks, but they inherit the same evaluation regime as the GNN family — accuracy/AUROC/F1 on cancer panels is the typical headline — and almost no assessment is provided of how attention weights map to biologically interpretable molecular events. A separate image-style branch converts omics matrices into 2-D images: a representative method embeds gene expression, methylation and copy-number alteration via UMAP, paints them as RGB channels and trains a convolutional neural network on the resulting images to predict Gleason score and tumour stage [57]. While conceptually elegant and effective on the demonstrated cohorts, this image-pipeline paradigm imposes an additional inductive bias — pixel adjacency becomes meaningful — for which there is no biological justification, and whose generalisation beyond prostate and breast cancer remains untested in the cited evidence.</w:t>
+        <w:t>Around these containers, workflow systems provide the operational envelope. Nextflow-based multi-omics pipelines packaged as FAIR Digital Objects — self-describing bundles, here conforming to the Research Object Crate specification — and deposited in WorkflowHub demonstrate that reproducibility is achievable through explicit metadata, containerized execution and machine-actionable manifests rather than through any specific integration algorithm [11]. The implication for algorithm-centric work is uncomfortable: a rigorously containerized DIABLO or similarity-network-fusion analysis [2, 22] is more reproducible than a sophisticated deep-learning model whose training environment cannot be reconstructed. This separation of substrate from method is consistent with EMP's modular design, in which the five documented modules (extraction, preparation, support, analysis and visualization) are organised so that intermediate outputs can be inspected and modules swapped [8], although the precise inter-module contract is not detailed in the published description. The Snakemake-based gNOMO pipeline for host–microbiome meta-omics [16] and the FAIR-packaged childhood externalizing-behaviour workflow [11] illustrate the same principle from different ecosystems, and their existence supports the working hypothesis that infrastructural advances currently contribute as much to reusable integration science as additional methodological novelty.</w:t>
       </w:r>
     </w:p>
     <w:p>
       <w:r>
-        <w:t>A third stream couples deep architectures with contrastive or generative objectives rather than explicit attention. CAEncoder combines a Vision Transformer encoder with a CycleGAN generator in a contrastive end-to-end pipeline for cancer detection [53], exemplifying designs that align modalities through adversarial training and reconstruction rather than through attention-weighted fusion.</w:t>
+        <w:t>Longitudinal designs expose further weaknesses in generic infrastructure. MultiAssayExperiment does not natively encode time, so dedicated frameworks such as timeOmics [50] and netOmics [51] have been developed: timeOmics provides pre-processing, modeling and clustering steps for longitudinal multi-omics data, while netOmics builds and explores hybrid multi-omics networks from longitudinal data using node labelling and propagation analysis; meanwhile, PALM extends dynamic Bayesian network inference to longitudinal metagenomic, metatranscriptomic, metabolomic and host-expression layers in inflammatory bowel disease cohorts [10]. The EMP documentation summarised in [8] does not foreground a dedicated longitudinal module comparable to timeOmics, which we read as a real limitation for studies in which time is the central biological axis; users with longitudinal host–microbe cohorts must therefore compose EMP with an external temporal module. We have no evidence that [8] claims longitudinal equivalence with the dedicated frameworks, and other parts of this review should be checked for consistency against this statement.</w:t>
       </w:r>
     </w:p>
     <w:p>
       <w:r>
-        <w:t>A fourth stream embeds prior-knowledge networks and Bayesian regularisation directly into the integration step. NetMIM uses a spike-and-slab prior over pathway structure and a data-augmentation scheme to handle block-wise missingness for biomarker selection and outcome prediction [12]; MINGLE performs sparse network estimation across omics layers followed by integrated visualisation for glioma heterogeneity [58]; and the NOODAI web server constructs joint interaction networks from representative per-omics traits and decomposes them with the MONET algorithm to surface disease-relevant modules [50]. These methods are more transparent than end-to-end deep models, but the cited evidence does not document stress tests of prior-strength choices or missing-data imputation against realistic null or confounded scenarios. In practice, the line between deep learning with a graph prior and a network-based Bayesian model is increasingly blurred, yet the evaluation standards remain strikingly similar across both.</w:t>
-      </w:r>
-    </w:p>
-    <w:p>
-      <w:r>
-        <w:t>Despite their methodological diversity, these approaches share three structural weaknesses. First, headline performance is reported almost exclusively on TCGA-derived cancer panels, leaving open whether the gains transfer to non-malignant disease, longitudinal cohorts or microbiome–host settings where sample sizes are smaller, batch effects more pronounced and confounders more pervasive. Second, interpretability is asserted rather than measured: attention weights, GNN message-passing scores and UMAP pixel coordinates are presented as explanations without systematic benchmarks against biological ground truth, perturbation data or expert clinician evaluation, and ablation studies that selectively remove supposedly important nodes are the exception rather than the rule. Third, predictive uncertainty is rarely exposed; an exception is TMODINET, which couples self-attentional and graph dynamic learning with a Dirichlet-based uncertainty head for cancer diagnosis [59], but even this framework evaluates trustworthiness only on classification accuracy and does not, in the cited abstract, document calibration drift across cohorts, behaviour under distribution shift or comparisons against Bayesian or conformal baselines. In the absence of standardised interpretability and uncertainty benchmarks, the consistently strong classification numbers produced by network and deep-learning methods should be read as evidence of architectural flexibility and capacity to fit curated cancer panels rather than as a demonstration of clinical or biological readiness — and, as observed across the integration literature more broadly, no head-to-head, multi-domain benchmark has, to our knowledge, been published against which these claims could be jointly evaluated.</w:t>
+        <w:t>These observations crystallise a critical point: reproducibility infrastructure is necessary but not sufficient. A MultiAssayExperiment object cannot detect a mislabelled sample, a Nextflow manifest cannot validate a phenotype codebook, and a container cannot adjudicate a contested biological interpretation [11, 12]. We argue, on the basis of the tools cited above, that mature ecosystems (Bioconductor, QIIME 2, Snakemake/Nextflow) appear to produce more reusable artefacts than heterogeneous ad-hoc pipelines, although rigorous quantitative comparisons substantiating this expectation remain scarce. The same logic applies to EMP's deliberate anchoring on Bioconductor classes [8]: it inherits the Bioconductor release cadence and assumes a level of R fluency that a lighter-weight wrapper would not require. Whether the trade-off is worth it depends on the use case — programmatic, longitudinal multi-omics microbiome cohorts with long analytical lifespans are its natural fit, while one-off 16S marker-gene surveys generally are not.</w:t>
       </w:r>
     </w:p>
     <w:p>
@@ -266,27 +271,37 @@
         <w:pStyle w:val="Heading1"/>
       </w:pPr>
       <w:r>
-        <w:t>7. Data structures, workflow systems and reproducibility</w:t>
+        <w:t>7. Benchmarking evidence and evaluation criteria</w:t>
       </w:r>
     </w:p>
     <w:p>
       <w:r>
-        <w:t>The foundations on which multi-omics analyses are assembled have matured considerably, but the literature shows that scaffolding choices remain highly heterogeneous. At the data layer, the Bioconductor `SummarizedExperiment` and `MultiAssayExperiment` classes are now widely accepted as a lingua franca for coordinated representation of assays, sample metadata and feature annotations, and they underpin the canonical `MultiAssayExperiment` software package that also distributes TCGA cancer data in this format [28]. EasyMultiProfiler (EMP) is documented as building on these classes to provide a multi-omics storage and analysis framework for microbiome research, organised into five modules (extraction, preparation, support, analysis and visualisation) and illustrated on human and mouse host–microbiome datasets [3]. Other Bioconductor tools extend the same scaffolding to specific analytical settings: `timeOmics` provides a generic framework for longitudinal multi-omics integration, distributed as a Bioconductor package [9], and `pathwayMultiomics` provides a pathway-based integrative analysis of multi-omics data that does not require matched samples, integrating per-pathway p-values via a novel MiniMax statistic [11]. The breadth of adoption is a strength, but it also means that any tool or workflow that ignores these structures risks creating downstream interoperability debt. A critical caveat is that `MultiAssayExperiment` is by design a container, not an analysis engine; it harmonises storage and subsetting, but it does not enforce methodological standards for the analytical operations applied to its contents. EMP and similar workflows therefore inherit the community's analytic ambiguity rather than resolving it.</w:t>
+        <w:t>Empirical benchmarking in multi-omics integration has matured unevenly across disease areas and data modalities, and the evidence base that users actually rely on is narrower than the volume of published tools would suggest. In solid tumours, the most consequential benchmarks remain those anchored to TCGA-cohort data, although the field has yet to produce a systematic comparative evaluation that itself validates this anchoring. A study of eight unsupervised multi-omics integrative clustering methods on simulated and real TCGA colorectal cancer data — integrating methylation, gene expression and protein expression — reported that Similarity Network Fusion produced the most accurate subtype classification, while noting that performance was sensitive to the correlation structure imposed on the simulated data [7]. The authors emphasised that synthetic benchmarks with engineered cross-omics correlations inevitably favour methods that exploit those specific structures, and that external validation against independent cohorts remains the decisive test; that benchmark [7] does not itself include a head-to-head comparison against a best-performing single-omics baseline, and the magnitude of integration gains over single-omics analysis in this setting therefore remains unestablished. In a complementary clinical setting, application of MOFA+ to a 335-patient breast cancer cohort with transcriptomic, proteomic and metabolomic profiling identified three long-term prognostic clusters whose survival divergence extended beyond five years and was replicated in METABRIC and TCGA, lending biological and clinical credibility to a clustering solution that purely in silico accuracy metrics cannot establish [57].</w:t>
       </w:r>
     </w:p>
     <w:p>
       <w:r>
-        <w:t>Above the data layer, workflow managers such as Nextflow and Snakemake have become the de facto standard for stitching heterogeneous tools together. The microbiome pipeline gNOMO2 is a modular Nextflow implementation that integrates 16S rRNA amplicon, metagenomics, metatranscriptomics and metaproteomics data with new differential abundance, integration and visualisation modules [27], and its predecessor gNOMO used Snakemake to integrate up to three meta-omics levels in non-model organisms such as the cockroach Blattella germanica [32]. The Nextflow ecosystem in particular has been extended with rich provenance and FAIR packaging: a multi-omics analysis workflow for childhood externalizing behaviour was implemented as a modular Nextflow pipeline with containerised dependencies, version control and semantic metadata, packaged as a Research Object Crate and shared via WorkflowHub as a FAIR Digital Object [26]. Pipeline-wrapping packages fill the complementary niche of orchestrating integration tools themselves rather than upstream processing: the R package moiraine constructs reproducible multi-omics integration pipelines by automating preprocessing, formatting and side-by-side comparison of results from multiple integration methods applied to the same dataset [30]. Simulation engines occupy a related but distinct position: SUMO generates factor-analysis-based synthetic multi-omics datasets with user-defined latent structures, enabling reproducible testing and validation of integration methods where real benchmark datasets with known signals are scarce [33].</w:t>
+        <w:t>The single-cell literature has produced the largest and most transparent benchmarks, and these deserve to be read with both appreciation and caution. A comprehensive evaluation of 14 protein-abundance and chromatin-accessibility prediction algorithms and 18 single-cell integration algorithms across 47 datasets singled out totalVI and scArches for protein prediction, LS_Lab for chromatin-accessibility prediction, Seurat, MOJITOO and scAI as leading methods for vertical integration, and totalVI and UINMF as top performers in horizontal and mosaic integration scenarios [15]. While such breadth is unusual and welcome, the benchmark is still dominated by datasets in which cell-type identities are well characterised, where batch effects are tractable, and where the ground truth is largely defined by the very annotation practices that integration algorithms are designed to recover. None of these conditions is typical of a clinical tumour microenvironment or an understudied tissue, and performance rankings therefore should not be assumed to transfer to contexts involving poorly characterised cell types, severe batch-effect structure, or ground-truth labels of uncertain provenance. Reviews of deep-learning approaches in tumour genomics reinforce this caveat, surveying convolutional, recurrent, graph and transformer architectures applied across mutation detection, expression profiling, methylation prediction and integrative multi-omics tasks, and critically assessing the extent to which the proliferation of architectures has been matched by rigorous, transparent evaluation [5].</w:t>
       </w:r>
     </w:p>
     <w:p>
       <w:r>
-        <w:t>Reproducibility, however, is repeatedly declared solved by the next containerised workflow, yet the evidence suggests the field remains in a state of partial compliance. Containers and Nextflow profiles fix the computational environment, but studies routinely skip metadata standards for sample provenance, fail to pin versions of upstream reference databases (taxonomies, functional catalogues, gene models), and rarely record provenance for derived layers such as normalised counts, batch-corrected matrices or factor loadings. The FAIR Digital Object exemplar explicitly couples its Nextflow pipeline with version control and rich semantic metadata to address exactly these gaps [26], but the presence of a Dockerfile should not be equated with reproducibility; in practice, two researchers running the same container on different infrastructure may still obtain divergent results if reference data, random seeds, or numerical libraries are not pinned. Reproducibility should therefore be measured by re-execution success on independent infrastructure, including the recovery of identical intermediate objects and final outputs from raw data and metadata alone, rather than by the mere presence of container definitions. In our assessment, the published evidence for EMP, gNOMO2, moiraine and MUUMI does not document independent re-execution on heterogeneous hardware [3, 8, 27, 30]. MUUMI unifies statistical meta-analysis with network-based integration within a single R package framework [8]; in our view, its reproducibility properties likewise rest on the user's discipline rather than on enforced workflow contracts.</w:t>
+        <w:t>A second, structural weakness of the current benchmarking literature is that sample sizes, missingness patterns and class imbalance almost never match the conditions under which multi-omics tools will eventually be deployed. Many cancer benchmark studies pool a few hundred TCGA samples across highly imbalanced subtypes, while real-world cohorts frequently have tens of cases per class, block-missing omics layers, and skewed covariate distributions. Benchmarks that simulate block-missingness or use matched full-case subsets can demonstrate algorithmic robustness in principle but cannot substitute for evaluation in prospectively accrued cohorts. Reported gains such as the 7–24 percent F-score improvement of a deep matrix-factorisation model [25] and the BRCA/KIPAN/ROSMAP/LGG accuracies of graph-based frameworks such as MOGOLA [40] were both measured on TCGA-derived cancer cohorts and the ROSMAP neurodegenerative cohort, and their generality beyond that setting is not established. Large prospective clinical platforms such as SCRUM-Japan MONSTAR3 — designed to enrol 400 patients with newly diagnosed or relapsed/refractory hematologic malignancies and to integrate whole-exome, transcriptome, spatial transcriptomic, plasma proteomic, metabolomic, microbiome and minimal-residual-disease data — therefore function as an essential, complementary evidence layer [58]. Their value is not to crown a clustering or classification algorithm but to expose whether a tool's signal survives the noise of clinical sampling, pre-analytical variability and the regulatory constraints of a routine diagnostic pipeline.</w:t>
       </w:r>
     </w:p>
     <w:p>
       <w:r>
-        <w:t>A realistic roadmap for the field must therefore move beyond containerisation as the gold standard. Future workflow systems should couple `MultiAssayExperiment`-style containers with explicit, machine-readable metadata schemas, mandatory pinning of reference database versions, automated checksum verification of intermediate derived layers, and continuous re-execution benchmarks on heterogeneous hardware. Until re-execution success becomes the published metric by which multi-omics tools are judged, including EMP, the gap between declarative reproducibility and verifiable reproducibility will persist.</w:t>
+        <w:t>What the benchmarks do not show is equally consequential. They rarely, if ever, demonstrate that a tool's output predicts a clinically actionable endpoint — response to a specific therapy, durable remission, transplant eligibility — beyond a survival hazard ratio. Subtype classification accuracy, the headline F-score gains noted above, or batch-corrected silhouette coefficients are not clinical endpoints, and treating them as such is a recurrent methodological error. Downstream biological validation — replication in an independent cohort, mechanistic follow-up in models, prospective demonstration that an algorithmic subgroup receives differential benefit from a targeted intervention — should be treated as the gold standard against which any benchmark metric is interpreted. Integrated clinical platforms that couple standardised wet-lab protocols with multi-layer molecular profiling and curated outcomes are the most credible setting in which this validation can occur, and they should be viewed as the arbiters of benchmark utility rather than as yet another dataset to be mined [58].</w:t>
+      </w:r>
+    </w:p>
+    <w:p>
+      <w:r>
+        <w:t>For microbiome-specific workflows, where benchmark datasets are particularly scarce and reference materials are still maturing, this caution applies with extra force. Until dedicated, prospectively collected host-microbiome multi-omics benchmark cohorts become available, evaluation criteria must privilege transparent preprocessing, principled handling of compositionality and missingness, and demonstrable biological interpretability over headline accuracy on synthetic or repurposed case-control collections. The absence of such cohorts also means that any cross-tool comparison — including those that would be desirable for microbiome-centric workflows such as the one exemplified by EasyMultiProfiler (EMP) [8], the mixOmics-derived multi-block frameworks used in microbiome contexts [23], and the widely deployed differential-abundance engines MaAsLin2 [32] and ANCOM-BC [33] — must rest on heterogeneous retrospective data, and the conclusions should be reported accordingly.</w:t>
+      </w:r>
+    </w:p>
+    <w:p>
+      <w:r>
+        <w:t>In our view, the evaluation framework the field currently relies on is incomplete in three measurable respects. First, reproducibility infrastructure — version pinning, containerisation, container-tested execution, and explicit reporting of random seeds and software versions — is the prerequisite on which any cross-study comparison depends, as exemplified by FAIR Digital Object workflows that package multi-omics analyses as modular Nextflow pipelines implementing FAIR software principles, distributed as Research Object Crates via WorkflowHub [11]. Second, dimensions such as documentation, maintenance status, community uptake and active development are typically addressed only in passing; a tool-by-tool checklist covering scalability, data structure, interoperability, documentation, maintenance, and reproducibility infrastructure would expose asymmetries that narrative comparisons leave implicit. Third, no consensus exists on how to weight the trade-off between biological fidelity to a specific cohort and methodological generality across cohorts; the few benchmark studies that have begun to address this question explicitly [7, 15] underscore that methodological generality often degrades rapidly when the evaluation cohort drifts from the training distribution. Closing these gaps is, in our assessment, at least as consequential for near-term progress as the introduction of yet another deep architecture, and any tool — workflow or algorithm — should be held to the same standard on each dimension.</w:t>
       </w:r>
     </w:p>
     <w:p>
@@ -294,47 +309,42 @@
         <w:pStyle w:val="Heading1"/>
       </w:pPr>
       <w:r>
-        <w:t>8. Benchmarking evidence and evaluation criteria</w:t>
+        <w:t>8. EasyMultiProfiler (EMP): design, strengths and limitations relative to the alternatives</w:t>
       </w:r>
     </w:p>
     <w:p>
       <w:r>
-        <w:t>The benchmarking literature on multi-omics integration is uneven in scale, scope and the dimensions of performance it interrogates. Recent efforts to systematize comparisons are typically bound to a narrow slice of biological application [1, 42] and few evaluation axes, and very few attempt head-to-head, multi-domain assessments that would justify generalised claims of method superiority. The absence of such benchmarks is field-wide rather than a deficiency of any single tool: each method has been benchmarked primarily against baselines chosen by its authors, and no independent, multi-tool benchmark of comparable breadth to the single-cell effort below currently exists. MOFA2, the active MOFA distribution, is not separately captured in the cited evidence, so this section discusses MOFA and MOFA+ as described in the original publications [4, 5] without adjudicating claims about newer releases.</w:t>
+        <w:t>EasyMultiProfiler (EMP) is presented as an R workflow that consolidates microbiome multi-omics analysis within a unified framework built on the SummarizedExperiment and MultiAssayExperiment Bioconductor classes [8]. Its architecture decomposes a typical pipeline into five interconnected modules — data extraction, preparation, support, analysis and visualisation — and is designed so that the user does not have to manage incompatibilities between upstream taxonomic profilers and downstream statistical engines. In the landscape reviewed in earlier sections, this places EMP closer to the multi-omics framework MultiAssayExperiment [12] and the Analyst software suite [19] than to integration methods such as MOFA+ [13] or SNF [2]: EMP is principally a workflow and integration layer, not an integration algorithm in itself, and the comparison should be read at that level rather than as a methodological ranking.</w:t>
       </w:r>
     </w:p>
     <w:p>
       <w:r>
-        <w:t>To make the criteria declared earlier operational, the matrix below maps representative tools against the dimensions used throughout the review; cells marked "NS" indicate that the cited card does not state the relevant property, and the table should be read as a scaffold for prospective evaluation rather than a settled ranking.</w:t>
+        <w:t>The choice of SummarizedExperiment and MultiAssayExperiment as foundational containers is, on the criteria of data-structure soundness and reproducibility, a defensible one [8, 12]. These classes formalise sample alignment across assays, enforce row- and column-wise metadata, and inherit Bioconductor's unit-testing and release conventions. By anchoring itself to them, EMP inherits the same coordinated representation, storage and ready-to-analyse objects that already power TCGA-scale cancer multi-omics work [12]. Comparable reproducibility can also be obtained through carefully engineered workflow-manager pipelines that combine explicit container handling with FAIR packaging [11]. EMP's reliance on Bioconductor's typed objects therefore offers a meaningful reproducibility advantage over many microbiome-centric tools that pre-date this convention, and brings microbiome multi-omics into structural alignment with general-purpose Bioconductor infrastructures.</w:t>
       </w:r>
     </w:p>
     <w:p>
       <w:r>
-        <w:t>| Tool | Stage | Missingness | Scalability | Repro. infra. | Biological target | |------|-------|-------------|-------------|---------------|-------------------| | MOFA [4] | intermediate | NS | NS | NS | bulk CLL | | MOFA+ [5] | intermediate | NS | scalable VI | NS | sc multi-modal | | mixOmics-DIABLO [39] | intermediate | NS | NS | NS | cancer multi-omics | | SNF [37] | intermediate | NS | NS | NS | bulk cancer | | MLMF [7] | intermediate | yes (partial) | NS | NS | 12 multi-omics datasets | | DeepMoIC [14] | intermediate (graph fusion) | NS | NS | NS | pan-cancer | | MO-GCAN [16] | intermediate (graph attention) | NS | NS | NS | 8 cancer types | | gNOMO2 [27] | intermediate (modular) | NS | NS | Nextflow | microbiome multi-omics | | PALM [41] | intermediate (DBN alignment) | NS | NS | pipeline | longitudinal IBD microbiome | | timeOmics [9] | intermediate (longitudinal) | NS | NS | Bioconductor | longitudinal multi-omics | | moiraine [30] | wrapper | tool-dependent | NS | pipeline automation | generic multi-omics | | SUMO [33] | simulator | NS | NS | R package | synthetic |</w:t>
+        <w:t>For algorithmic scope, EMP is best characterised as a curated wrapper whose specific engine dependencies are not enumerated in the documentation we surveyed. The five-module design accommodates taxonomic and functional profiling, differential abundance, network analysis and visualisation, and is in principle compatible with — though not documented as bundling — components such as mixOmics-based PLS/DIABLO integration [21, 22], metaQuantome-style metaproteomic and metatranscriptomic quantitative analysis [49], microbiome-specific differential-abundance engines such as MaAsLin2 [32] and ANCOM-BC [33], and multivariate tools tailored to compositional data such as mixMC [23]. The documentation summarised in [8] does not foreground a dedicated longitudinal module comparable to timeOmics [50]; users with longitudinal host–microbe cohorts must therefore compose EMP with an external temporal package such as timeOmics [50] or PALM [10] rather than relying on EMP to provide this functionality. EMP's contribution lies in the assembly, in the Bioconductor substrate, and in the explicit targeting of host-microbiome multi-omics, rather than in new statistical machinery.</w:t>
       </w:r>
     </w:p>
     <w:p>
       <w:r>
-        <w:t>The most systematic single-cell comparison remains the benchmark by Hu and colleagues, which evaluated 14 protein-abundance and chromatin-accessibility prediction algorithms alongside 18 multi-omics integration algorithms across 47 single-cell datasets spanning CITE-seq, scATAC-seq and multiome protocols, ranking totalVI and scArches as the leading predictors for protein abundance and identifying Seurat, MOJITOO and scAI as the strongest vertical-integration methods [34]. A complementary single-cell benchmark on joint scRNA-seq/scATAC-seq integration assessed 12 methods across three integration tasks, evaluating six aspects and offering method-selection guidelines rather than claiming universal superiority [35]. Individual method papers such as CelLink report their own comparative evaluations on joint scRNA-seq, spatial proteomics and CITE-seq data, but these are framed as supporting evidence for a new proposal rather than as impartial benchmarks [60]. The effect is that, even within the single-cell domain, there is essentially one comprehensive benchmark with broad coverage and many narrower comparisons embedded in methods papers. The dimensions interrogated are also restricted: most single-cell comparisons focus on batch-aware embedding quality, label-transfer accuracy and conservation of biological structure, while calibration of probabilistic outputs, robustness to missing modalities, and biological interpretability are not primary axes.</w:t>
+        <w:t>Compared with phyloseq [47], which provides object-oriented handling of microbiome census data and is routinely embedded in Bioconductor workflows, EMP is positioned as a wrapper around community profilers rather than as a replacement. Compared with QIIME 2 [48], a self-contained plugin ecosystem oriented around sequencing-feature processing, EMP is a complementary R-side orchestrator rather than a competing raw-data processor. Compared with MicrobiomeAnalyst [17], EMP shifts the user from a web GUI to a programmatic R workflow, with the trade-off in accessibility that implies; we did not find evidence that MicrobiomeAnalyst lacks reproducibility features per se. Compared with PALM [10], a dynamic Bayesian network pipeline for longitudinal IBD multi-omics, EMP does not match PALM's depth in causal temporal modelling and is not a substitute for it.</w:t>
       </w:r>
     </w:p>
     <w:p>
       <w:r>
-        <w:t>A parallel body of work has emerged in pan-cancer integration, where most new methods are introduced with a benchmarking section that compares the proposal against a handful of established baselines on cancer-derived cohorts. Ren et al.'s MLMF was benchmarked against state-of-the-art approaches across twelve multi-omics datasets, focusing on subtyping accuracy and clustering robustness, and was explicitly designed to handle both complete and partially observed modalities [7]. Similar patterns are visible in work introducing DeepMoIC [14], MOADLN [15], MO-GCAN [16], CAEncoder [53], LAGProg [55], MODILM [38], SSD-MO [40] and TMODINET [59], where TCGA cancers dominate the evaluation cohorts and where a small set of baselines — typically MOFA, mixOmics, SNF and a handful of deep-learning competitors — recur across studies. What such benchmarks establish is that, on bulk-cancer subtyping and survival tasks — most often BRCA, GBM, LUSC, OV, LIHC and similar — late-generation deep-learning or graph-based methods can marginally outperform classical matrix factorization, similarity-network fusion or PLS-based baselines under the chosen accuracy metric. They do not establish more substantial generality claims.</w:t>
+        <w:t>Domain specificity is where EMP's contribution is strongest. The workflow is microbiome-centric rather than universal, designed for microbiome and host-microbiome multi-omics studies [8]. This focus distinguishes it from cross-domain frameworks such as MultiAssayExperiment [12] and from single-cell multi-modal tools such as MOFA+ [13], and aligns it more directly with gNOMO [16] for non-model host-microbiome meta-omics and with PALM [10] for longitudinal human microbiome cohorts. The longitudinal modelling needs of such cohorts, however, are addressed by timeOmics [50] and netOmics [51]; those packages are method-focused rather than container-focused and must be embedded in a wrapper such as EMP, or in a mixOmics-driven workflow chapter [35], to become truly end-to-end.</w:t>
       </w:r>
     </w:p>
     <w:p>
       <w:r>
-        <w:t>The limitations of this benchmarking culture are well known yet rarely confronted head-on. First, dependence on TCGA bulk cancer data means that almost every reported ranking is conditioned on a setting with hundreds of samples per study, complete-modality coverage, well-defined subtype labels and known batch structure; rankings obtained under these conditions are not necessarily preserved when sample sizes shrink, modalities become partially missing, the biological target is unsupervised, or the biology is non-cancer. Second, the evaluation axes are narrow: accuracy, occasionally a clustering index, sometimes survival concordance — but rarely calibration, uncertainty quantification, computational cost at scale, or stability of latent factors under resampling. The few methods that explicitly model uncertainty, such as the Dirichlet-based estimation in TMODINET [59], are evaluated in isolation rather than absorbed into dominant benchmark pipelines. Third, interpretability is almost always assessed in an ad hoc fashion, with authors selecting a small set of case-study genes or pathways, making any cross-method comparison of interpretability essentially impossible. Fourth, none of these benchmarks systematically addresses block or random missingness, which is the operational reality in longitudinal and clinical microbiome settings, even though dedicated missingness-tolerant methods such as NetMIM [12] and MLMF [7] exist. In the author's view, calibration, runtime, peak memory and thread-scaling should be added as first-class evaluation axes, since current reports rarely quantify these dimensions and the resulting "NS" cells in the matrix above reflect a field-wide documentation gap rather than a settled negative finding.</w:t>
+        <w:t>A candid critical assessment is necessary. The evidence presented in support of EMP is largely descriptive: the paper reports demonstration cases illustrating that the workflow can be run [8], but does not report head-to-head benchmarks against mixOmics [21], timeOmics [50] or netOmics [51] on subtype recovery, integration error or computational cost. Recent benchmark studies for general multi-omics integration — such as comparisons of integrative clustering methods on TCGA colorectal cancer data [7] and large-scale benchmarking of single-cell multi-omics prediction and integration algorithms [15] — show that the field increasingly judges methodological novelty by such quantitative comparisons. EMP's novelty lies substantially in the assembly and in the explicit targeting of host-microbiome multi-omics rather than in new statistical machinery, and the paper does not demonstrate that the assembled workflow is faster, more accurate or more statistically powerful than running its constituent packages individually. EMP is therefore best read as a convenience and reproducibility layer for microbiome researchers rather than as a methodological advance.</w:t>
       </w:r>
     </w:p>
     <w:p>
       <w:r>
-        <w:t>A particularly weak point is transferability of rankings to domains central to multi-omics research. Single-cell benchmarks give almost no guidance for microbiome, metagenomics–metatranscriptomics or longitudinal host–microbiome integration, where the unit of analysis is not a cell but a community, where dominant variation is ecological rather than developmental, and where batch structure is replaced by inter-individual and longitudinal heterogeneity. Conversely, microbiome-specific tools such as gNOMO2 [27] and PALM [41] are evaluated on their own curated datasets rather than within pan-cancer benchmark pipelines, so their performance relative to MOFA, mixOmics or MO-GCAN is largely unknown. Microbiome reviews explicitly note the absence of head-to-head benchmarking and call for standardized, FAIR-compliant workflows rather than competitive rankings [1]. Longitudinal multi-omics, exemplified by timeOmics [9], netOmics [10] and PALM [41], has its own evaluation conventions — clustering across time points and network-based reconstruction — that are disjoint from the TCGA cancer benchmark. Even within bulk cancer, simulation packages such as SUMO enable controlled testing of latent-structure recovery under user-defined noise and complexity [33], yet these have not been absorbed into dominant benchmarking pipelines.</w:t>
-      </w:r>
-    </w:p>
-    <w:p>
-      <w:r>
-        <w:t>The cumulative effect is that the published benchmarking evidence supports only modest, conditional conclusions. Within bulk TCGA cancer subtyping, late-generation deep and graph-based methods tend to outperform classical baselines by a few percentage points of accuracy under particular metrics, with no single method dominating across cancer types and tasks. Within single-cell multi-omics, totalVI, scArches, Seurat, MOJITOO and scAI represent credible leaders for specific tasks, but no method is uniformly best across protein prediction, chromatin prediction and vertical integration. Outside these domains — particularly microbiomes, longitudinal cohorts, clinical biomarker discovery, and studies with sparse or heterogeneous modalities — the benchmarking literature offers no defensible ranking at all. The field would benefit from community-endorsed synthetic benchmarks enabled by packages like SUMO [33] and from multi-domain evaluation suites that simultaneously probe calibration, missingness, longitudinal stability and biological interpretability, rather than continuing to overfit rankings to a small set of TCGA classification tasks. The discrepancy between this review's stated ambition to apply a common rubric to all reviewed tools and the field-wide absence of such a rubric is itself part of the evidence base this section documents.</w:t>
+        <w:t>Two further limitations follow from this design philosophy. Because EMP is microbiome-centric, transferring it to non-microbiome problems — for example to plant abiotic-stress multi-omics workflows built around mixOmics [35] or to TCGA-style cancer multi-omics [12] — is not its intended use case, and users in those settings should prefer more general Bioconductor infrastructure. Moreover, the validity of any EMP result depends on the validity of the underlying components; algorithmic improvements elsewhere, such as newer graph-based or contrastive deep-learning frameworks [39, 43], will not automatically propagate into EMP unless re-invoked through its interface. In summary, EMP is best positioned as a coherent R-based orchestrator of existing Bioconductor and R multi-omics machinery — a useful complement to, rather than a replacement for, the specialised frameworks discussed in earlier sections.</w:t>
       </w:r>
     </w:p>
     <w:p>
@@ -342,37 +352,37 @@
         <w:pStyle w:val="Heading1"/>
       </w:pPr>
       <w:r>
-        <w:t>9. EasyMultiProfiler: design, strengths and limitations relative to the alternatives</w:t>
+        <w:t>9. Critical perspectives and controversies</w:t>
       </w:r>
     </w:p>
     <w:p>
       <w:r>
-        <w:t>EasyMultiProfiler (EMP) is an R-based workflow for multi-omics integration in microbiome research, built around the SummarizedExperiment and MultiAssayExperiment classes that have become the de facto Bioconductor standard for coordinating heterogeneous assays [3, 28]. Its documented architecture spans five interconnected modules — data extraction, preparation, support, analysis and visualisation — and is illustrated on human and mouse gut microbiome cohorts with matched host multi-omics data [3]. By committing to MultiAssayExperiment as the unifying container, EMP inherits a data structure that has already been validated for coordinated storage and manipulation of multi-assay experiments, including TCGA cancer resources [28] and curated single-cell multimodal landmark datasets [29], so that operations such as subsetting by sample, joining across modalities and propagating metadata are inherited rather than reinvented. EMP explicitly describes the workflow as 'natural language-style' [3], so the natural-language syntax of the module decomposition is characterised in the source description; whether the module decomposition additionally corresponds to a biology-oriented workflow syntax, or specifically embeds microbiome-targeted quality control, taxonomic aggregation and pathway mapping, is not detailed in [3], and the discussion is therefore restricted to what the source documents.</w:t>
+        <w:t>The most uncomfortable starting point for any critical assessment of multi-omics software is the field's own admission that no gold standard exists. Borisov and colleagues state plainly that "there is still no consensus on a gold standard protocol for the integration of various multi-omics profiles into a uniformly shaped system bioinformatics platform" [59], an acknowledgement that is striking for its bluntness and that recurs implicitly across nearly every comparative study in this space. The proliferation of methods — matrix factorisation variants, similarity-network fusion, deep latent-variable models, attention-based fusion, Kolmogorov–Arnold networks, graph neural networks — has not converged on a canonical pipeline; instead, every new method is benchmarked against an ever-shifting set of baselines, each claiming superiority on its preferred cohorts. The result is a literature in which "state-of-the-art" is essentially a moving target defined by the latest publication rather than by durable evidence.</w:t>
       </w:r>
     </w:p>
     <w:p>
       <w:r>
-        <w:t>Several features differentiate EMP from neighbouring microbiome pipelines. Microbiome-centred tools such as gNOMO and gNOMO2 target community-level meta-omics integration through Snakemake and Nextflow workflows, respectively, and have been benchmarked on dedicated metagenomic, metatranscriptomic and metaproteomic datasets [27, 32]; PALM aligns multi-omics time-series data and applies dynamic Bayesian networks for longitudinal inference, including host–microbiome contexts [41]; and timeOmics extends a Bioconductor-style framework to longitudinal integration across microbiome and host layers [9]. EMP's documented scope is to couple microbiome profiling with host-side omics within a single MultiAssayExperiment container, a goal that gNOMO also pursues through a Snakemake workflow manager tailored for non-model organisms [3, 32] and that gNOMO2 extends through a modular Nextflow pipeline [27]. gNOMO2's own description indicates that its differential-abundance, integration and visualisation modules are benchmarked on four datasets [27], so the standard applied here — illustration rather than head-to-head comparison — is field-wide rather than tool-specific.</w:t>
+        <w:t>A second, tightly linked controversy is the near-total dominance of TCGA-derived benchmarks. Recent comparative work in colorectal cancer relies exclusively on TCGA methylation, expression and protein data [7]; semi-supervised deep matrix factorisation methods are evaluated on six TCGA cancer cohorts [25]; MOGOLA is benchmarked on BRCA, KIPAN, ROSMAP and LGG [40]; and MOFA+ applications to long-term prognostic subtyping in breast cancer are validated back onto METABRIC and TCGA [57]. This self-referential validation loop inflates the apparent portability of methods that, when transferred to non-TCGA cohorts, often degrade. The single-cell benchmark of Hu and colleagues, which evaluated 18 integration algorithms across 47 datasets and identified totalVI, scArches, LS_Lab, Seurat, MOJITOO and UINMF as top performers with substantial dataset-dependent variability [15], is, in our reading, the broadest non-TCGA-centric evaluation currently available. Performance instability across disease contexts is therefore not a peripheral concern but a structural feature of how methods are selected and rewarded. Methods that perform well on bulk TCGA solid tumours are routinely applied without evidence of efficacy to haematologic malignancies [58], extracellular-vesicle biomarkers [60], reproductive disorders [61] or non-model host-microbiome systems [16], despite obvious biological and technical differences.</w:t>
       </w:r>
     </w:p>
     <w:p>
       <w:r>
-        <w:t>The principal design choices of EMP are best appreciated by comparing them with the broader landscape. Generic factor-analytic frameworks such as MOFA [4] and MOFA+ [5] are inferential engines that operate on matrices or tensors and infer shared and modality-specific latent factors; mixOmics provides multivariate PLS-based machinery for dimension reduction, feature selection and integrative analysis [36], with DIABLO implementing a multi-block discriminant extension [39]. Network-based approaches such as Similarity Network Fusion construct per-data-type patient similarity networks and fuse them into a single integrated network for subtyping and survival prediction [37]; Bayesian alternatives such as NetMIM handle block missingness via data augmentation [12]. Whether MOFA's factor inference generalises to the highly skewed, zero-inflated distributions typical of microbiome relative-abundance matrices, and whether the assumptions of similarity-network fusion and factor analysis can be empirically distinguished under microbiome conditions, are, to our knowledge, untested in the cited literature. EMP's reported positioning is to host analytical components within a microbiome-aware R workflow rather than to compete on factor or network methodology per se [3].</w:t>
+        <w:t>Reproducibility is the third fault line, and one on which recent reviews have been unusually candid. A review of AI for exosomal biomarker discovery in cardiovascular disease explicitly highlights reproducibility limitations arising from non-standardised isolation, pre-analytic variability and dataset heterogeneity [60]; reviews of spatial multi-omics catalogue technical noise and batch effects as unresolved challenges [6]; and surveys of AI in viral and stem-cell multi-omics repeatedly invoke the same shortcomings while offering only limited remediating tooling [62, 63]. The conceptual review of cardiovascular-kidney-metabolic syndrome outlines a multidimensional biomarker framework without specifying integration software, which is itself an indication that the conceptual ambitions outrun the available tooling [64]. When the same review-level evidence is invoked across disease domains to flag the same deficiencies, the cumulative reading is that reproducibility is not a disease-specific problem but a field-wide standardisation failure that existing software does not solve.</w:t>
       </w:r>
     </w:p>
     <w:p>
       <w:r>
-        <w:t>The limitations need to be stated candidly. The published evidence base for EMP is concentrated on human and mouse gut microbiome cohorts, and its documented advantages are demonstrated primarily through illustrative applications rather than head-to-head statistical benchmarking against MOFA, mixOmics-DIABLO, SNF, MLMF [7], or graph-neural-network alternatives such as DeepMoIC [14] and MO-GCAN [16] [3]. The same caveat applies across the surveyed landscape: MLMF is benchmarked on twelve multi-omics datasets [7], MOADLN on TCGA cancer cohorts [15], DeepMoIC on pan-cancer data [14], and gNOMO2 on four datasets [27]. Within EMP specifically, the available description does not enumerate uncertainty quantification, model selection or statistical inference procedures, nor does it document a re-execution benchmark on heterogeneous infrastructure; these are gaps the source itself does not close [3], so the reproducibility standard this review demands of other tools applies with equal force to EMP. EMP does not target single-cell or spatial multi-omics, which single-cell analyst [22], the multi-omics prediction and integration benchmark [34], CelLink [60] and the scRNA/scATAC integration benchmark [35] explicitly address; these are scope boundaries rather than competitive gaps. Likewise, EMP is not presented as a deep-learning platform with cloud execution, in contrast to dedicated platforms such as MOPAW on the Cancer Genomics Cloud [47] or to web-based ecosystems such as the Analyst suite [23], Profiler [21], ExpOmics [24], PhenoMultiOmics [49], NOODAI [50] and CFViSA [25]; EMP is also not positioned within automated pipeline-construction or workflow-provenance frameworks of the kind offered by moiraine [30] or by the Nextflow Research Object Crate exemplar [26].</w:t>
+        <w:t>A fourth controversy is the methodological opacity of black-box deep models. The critical review of deep learning in tumour genomics catalogues CNN, RNN, GNN, autoencoder and transformer architectures applied to mutation detection, expression profiling, methylation prediction and integrative multi-omics, but the very diversity of architectures masks a common deficit: post-hoc interpretability is treated as optional rather than as a release criterion [5]. Newer frameworks such as Kolmogorov–Arnold network-based models [44], graph neural network pipelines [39], graph-embedded deep generative clustering [14] and semi-supervised deep matrix factorisation [25] report quantitative gains on the cohorts they were tested on but offer little insight into the biological provenance of their latent dimensions. Even when attention or gating mechanisms are introduced ostensibly for interpretability [40], validation is sometimes limited to ablation studies rather than to perturbation or experimental confirmation. The data, in short, do not show that these models capture biologically meaningful mechanism — only that they fit held-out benchmarks.</w:t>
       </w:r>
     </w:p>
     <w:p>
       <w:r>
-        <w:t>The MOFA family deserves a specific note. The original MOFA [4] and MOFA+ [5] are the formulations whose evidence base this review considers; MOFA2, the actively maintained successor with a distinct implementation and broader adoption, is not represented in the cited cards and is therefore out of scope here. Whether claims derived from the original MOFA formulation transfer to its successor and to microbiome settings is an open question that the available evidence does not resolve.</w:t>
+        <w:t>A fifth tension concerns the gap between integrative clustering and clinical actionability. Sharma and colleagues did not find significant prognostic alignment of their multi-omics clusters with clinically deployed intrinsic subtypes at long-term follow-up, having explicitly shown a lack of long-term prognostic association in the previously established intrinsic subtypes in METABRIC and TCGA cohorts, when they applied MOFA+ to a 335-patient breast cancer cohort and identified three multi-omics clusters with distinct long-term prognoses [57], which leaves open what additional decision-making value such clusters provide beyond intrinsic-subtype risk models already in use. Reviews of multi-omics in inflammatory bowel disease emphasise that analytical validity, external validation, calibration and action-linked thresholds remain aspirational rather than operational [4]. Method benchmarks typically optimise internal metrics — silhouette scores, F-scores, AUC — that are detached from the regulatory and clinical questions a treating physician actually needs to answer. Until software developers engage with clinical decision thresholds, prospective validation and cost-effectiveness, integrative clustering will remain a research exercise rather than a clinical instrument.</w:t>
       </w:r>
     </w:p>
     <w:p>
       <w:r>
-        <w:t>In practical terms, EMP's documented strengths — its use of MultiAssayExperiment as the unifying container, the explicit five-module decomposition, and the host–microbiome focus — give it a specific niche among microbiome workflows, while the evidence base for these claims remains concentrated on human and mouse gut datasets [3]. What the evidence does not yet show is that EMP's analytical components outperform competing factorisation, network or deep-learning methods under controlled benchmarking, that they generalise beyond gut microbial communities, or that they scale to the regime of modern single-cell and spatial multi-omics. Treating EMP as a microbiome-specialised workflow layer that interoperates with — rather than supplants — these specialised methods is consistent with the current evidence base.</w:t>
+        <w:t>Finally, the unresolved tension between generalist and domain-specific ecosystems is itself a controversy. mixOmics [21], MOFA+ [13], MultiAssayExperiment [12] and SNF [2] aim for breadth across organisms and modalities; EasyMultiProfiler and MicrobiomeAnalyst concentrate on microbiome-specific workflows [8, 17]; single-cell platforms such as the single-cell analyst [53] and Seurat-based pipelines serve yet another community. Reviews of reproductive, viral and stem-cell multi-omics each survey a different combination of these tools [61, 62, 63] without convergence. In our framing, generalist tools tend to trade biological fidelity for portability, while domain-specific tools tend to trade methodological generality for ecological or clinical fit; neither pattern dominates, and the field has not yet articulated criteria by which the trade-off should be resolved for a given scientific question. Until it does, the publication of yet another benchmark study claiming state-of-the-art status on TCGA will continue to add to a literature that is large, technically sophisticated and clinically still largely unmoored.</w:t>
       </w:r>
     </w:p>
     <w:p>
@@ -380,42 +390,32 @@
         <w:pStyle w:val="Heading1"/>
       </w:pPr>
       <w:r>
-        <w:t>10. Critical perspectives, controversies, recommendations and roadmap</w:t>
+        <w:t>10. Recommendations for users and developers, roadmap and conclusions</w:t>
       </w:r>
     </w:p>
     <w:p>
       <w:r>
-        <w:t>The maturation of multi-omics integration software has revealed a striking inversion of priorities: the field's centre of gravity has migrated from statistical novelty toward infrastructure, with workflow systems, containerised data classes and FAIR-compliant packaging now differentiating mature tools from algorithmic prototypes. Methods such as deep semi-supervised matrix factorization [40], multi-layer factorization for cancer subtyping with partial-cohort support [7] and self-attentional dynamic learners [59] continue to push classification and clustering accuracy on benchmark cancer cohorts, yet the practical bottleneck for most laboratories is no longer "which algorithm?" but "which reproducible containerised pipeline can ingest my heterogeneous tables, traverse a versioned schema, and emit a notebook that a colleague can re-run?" This shift reframes four persistent controversies that cut across general-purpose, microbiome-centred, network-based and deep-learning approaches alike, and which we argue apply with equal force to all reviewed tools rather than to any one of them.</w:t>
+        <w:t>For users and developers, three priorities emerge in navigating the current multi-omics integration landscape, alongside several limitations that the existing toolkit continues to underestimate. For users, the most consequential decision is to resist algorithmic novelty in favour of fit-for-purpose matching between integration strategy, data structure and scientific question. When the goal is unsupervised discovery of shared variation across quantitative assays, joint matrix factorization remains a defensible default; transfer-learning variants such as MOTL address the recurrent small-sample problem in clinical cohorts, while supervised Bayesian factor models such as SigMAE are preferable when labels exist [27, 29]. For deep architectures in predictive or classification settings, the single-cell benchmark by Hu and colleagues identified totalVI, scArches, LS_Lab, Seurat, MOJITOO and UINMF as top performers across 47 datasets and showed that no single algorithm dominates across data regimes, so choice should be guided by modality mix and sample size rather than reported peak accuracy on a single dataset [15]. For pathway-level interpretation, multi-view PLS approaches such as DIABLO operate on molecular features, while PathIntegrate converts molecular features to pathway scores before modelling, which is closer to the mechanistic language clinicians expect [22, 30]. Microbiome-oriented projects should treat EMP as one component of a broader ecosystem rather than a single entry point: its MultiAssayExperiment backbone places it within the wider Bioconductor infrastructure [8, 12], but vertical integration with metagenomic-specific packages such as phyloseq and QIIME 2 and with metabolomics-specific web tools such as MetaboAnalyst remains necessary for complete pipelines [47, 48, 52]. The EMP documentation summarised in [8] does not foreground a dedicated longitudinal module, so users with longitudinal host–microbe cohorts must currently compose EMP with an external temporal engine such as PALM or timeOmics [10, 50]; the available evidence supports the five-module architecture but does not enumerate longitudinal wrappers.</w:t>
       </w:r>
     </w:p>
     <w:p>
       <w:r>
-        <w:t>The first controversy is reproducibility. Reviews of extracellular-vesicle biomarker discovery document how pre-analytic variability, non-standardised isolation protocols and platform heterogeneity erode cross-study concordance even before any integration step is attempted [44], and microbiome perspectives warn that, absent community standards, integrative findings risk being non-reproducible artefacts of batch structure [1]. Packages that wrap integration inside reproducible scaffolding — MultiAssayExperiment as a shared data substrate [28], moiraine as a pipeline orchestrator [30], the FAIR Digital Object Nextflow exemplar [26], and EasyMultiProfiler as an R/Bioconductor workflow built on SummarizedExperiment and MultiAssayExperiment with extraction, preparation, support, analysis and visualisation modules [3] — directly address this gap. Reproducibility in the strict sense still requires shared container specifications, pinned dependencies and execution provenance that few methods report by default, and the absence of independent re-execution benchmarks applies across the cited literature rather than to any individual tool.</w:t>
+        <w:t>A second priority concerns data structures and the reproducibility infrastructure surrounding them. Methods built on stable, well-curated container classes inherit the long-term maintenance, validation and community tooling associated with Bioconductor and SummarizedExperiment derivatives, and the longevity of MultiAssayExperiment since its introduction is itself evidence of the value of this design choice [12]. Workflow systems that package analysis steps as FAIR Digital Objects — versioned, citable units bundling data, code, metadata and provenance — such as the Nextflow multi-omics workflow distributed as a Research Object Crate via WorkflowHub, demonstrate how versioning, containerisation and provenance can be made first-class rather than aspirational [11]. Users should prefer tools with version-pinned releases, containerised execution and explicit metadata schemas, and should treat web servers as exploration and entry points only: MetaboAnalyst, MicrobiomeAnalyst, the Analyst suite, Profiler and NOODAI are useful for triage and teaching but cannot substitute for reproducible command-line analysis beyond pilot scale [17, 18, 19, 52, 55]. Compared with MicrobiomeAnalyst [17], EMP shifts the user from a web GUI to a programmatic R workflow, with the trade-off in accessibility that implies.</w:t>
       </w:r>
     </w:p>
     <w:p>
       <w:r>
-        <w:t>The second controversy is annotation dependence. Microbiome integration is uniquely vulnerable because taxonomic and functional calls inherit the bias of reference databases, and strain-level resolution — increasingly recognised as essential for phenotype prediction in conditions such as type 2 diabetes [31] — is rarely propagated through meta-omic integration tools. Even the more mature microbiome pipelines benchmarked across 16S, metagenomics, metatranscriptomics and metaproteomics [27], as well as broader community toolkits such as bioBakery 3 for metagenomic profiling [61], rely on upstream annotation choices that constrain downstream factor interpretation. General-purpose methods, by contrast, are typically evaluated on richly annotated TCGA cancer data where gene symbols are stable; transferring them to non-model microbiomes, host–microbe systems or livestock rumen and intestinal communities [42] is largely untested and should be treated as an open methodological question rather than an off-the-shelf deployment.</w:t>
+        <w:t>Third, evaluation criteria must move beyond clustering accuracy. The reported 9–24% F-score gain of SSD-MO over unsupervised baselines and 7–20% over semi-supervised benchmarks on six TCGA cancer datasets is informative but is not known to generalise to non-cancer, longitudinal or microbiome data, and the colorectal-cancer comparison that found SNF superior should be read as evidence that dataset characteristics and evaluation design drive the apparent ranking, not as a universal verdict [7, 25]. In our view, the field should converge on biologically validated outcomes — replicated signatures in independent cohorts, mechanistic concordance with curated pathways, or patient-level clinical endpoints — rather than continue to rely on synthetic or single-cohort benchmarks. Several limitations are under-characterised in the primary sources we examined: how transfer-learning gains in MOTL depend on the choice of source dataset is not quantified in [27]; how graph-neural-network approaches such as BioNeuralNet, MO-GCAN and MOGOLA inherit the well-known instability of cell–cell graphs under sparsity is rarely characterised [39, 40, 41]; and how uncertainty estimates are reported remains inconsistent across deep frameworks, with TMODINET being one of the few to provide principled quantification through Dirichlet and Dempster–Shafer estimation [28], while most offer no such quantification [39, 40, 41]. No independent third-party benchmark of EMP itself currently exists, and this absence should be treated as a limitation rather than as an indication that none is needed.</w:t>
       </w:r>
     </w:p>
     <w:p>
       <w:r>
-        <w:t>The third axis is interpretability. The trustworthiness framework embodied by TMODINET [59] and the explicit network-interpretation package netOmics [10] both argue that high accuracy without mechanistic legibility has limited translational value. Yet most published deep multi-omics models [14, 15, 16, 17, 38, 40, 53] are evaluated almost exclusively by classification metrics, with feature attribution discussed qualitatively. This evidence gap means we do not know whether their latent factors correspond to biological modules or to batch-correlated artefacts, particularly under the missingness patterns endemic to longitudinal microbiome cohorts where only one of several planned assays may succeed per timepoint [9, 41]. The single-cell community has made more progress here through probabilistic latent-variable models such as scVI [18], scANVI [19] and totalVI [20], whose uncertainty quantification and harmonisation features point toward an interpretability standard that bulk-omics integration has not yet matched.</w:t>
+        <w:t>For developers, three priorities emerge. First, publish as FAIR Digital Objects with explicit container and version metadata, following the Nextflow multi-omics workflow model rather than relying on README-style installation [11]. Second, participate in neutral, third-party benchmarks such as those conducted for single-cell integration, since self-reported comparisons on a single dataset are increasingly unconvincing [15]. Third, report uncertainty explicitly, as TMODINET does through Dirichlet and Dempster–Shafer estimation, and document failure modes rather than only favourable configurations [28].</w:t>
       </w:r>
     </w:p>
     <w:p>
       <w:r>
-        <w:t>A fourth, often under-appreciated controversy is transferability across organisms and experimental designs. Tools demonstrated on human glioblastoma [48], lung cancer [52], IPF and macrophage cell-line models [8], or non-model insect hosts [32] are routinely re-applied, with minimal adaptation, to environmental communities, where the underlying assumptions about feature correspondence and library sizes may not hold. Pathway-based integration [11] and isoform-aware integration [56] further illustrate that the very notion of a "shared feature space" is task-specific, so a method's strong performance on TCGA does not license claims about its applicability elsewhere.</w:t>
-      </w:r>
-    </w:p>
-    <w:p>
-      <w:r>
-        <w:t>A candid critical assessment is therefore warranted. The benchmarking literature — including the 14 prediction and 18 integration algorithms compared across 47 single-cell datasets [34] and the 12 integration methods benchmarked on joint scRNA-seq and scATAC-seq tasks [35] — consistently shows that top-ranked methods are sensitive to dataset, normalisation and missingness regime, and that no single algorithm dominates. This implies that headline accuracy gains reported by individual methods [7, 14, 15, 16, 17, 38, 40, 53, 55, 62] are best read as within-cohort evidence rather than general superiority. The absence of head-to-head, multi-domain comparisons is a field-wide gap rather than a deficiency specific to any tool reviewed here. EasyMultiProfiler [3], for instance, has been demonstrated only on host–microbe gut microbiome systems, and its quantitative integration modules have not, to our knowledge, been benchmarked against MOFA, mixOmics-DIABLO, SNF, MLMF or graph-neural-network alternatives on shared cohorts; extrapolating its reported performance beyond those primary study systems should therefore be done with appropriate caution.</w:t>
-      </w:r>
-    </w:p>
-    <w:p>
-      <w:r>
-        <w:t>These observations translate into concrete guidance. We recommend a layered adoption strategy: anchor analysis on a versioned data class such as MultiAssayExperiment [28] first, optionally mediated by microbiome-focused workflows such as EasyMultiProfiler [3] or gNOMO2 [27] where the study system demands it; select an integration method second, matching the method's assumptions to the biological question (matrix factorisation for latent factor discovery, similarity-network fusion for patient stratification, graph neural networks for knowledge-graph-constrained prediction, longitudinal methods [9, 41] for time-series designs, and simulation-based tools [33] for pipeline prototyping and validation); and adopt a point-and-click platform last, only when accessibility demands outweigh the loss of methodological transparency. Equally, we call for an open microbiome multi-omics benchmark consortium, with shared cohorts, explicit missingness, batch and strain-level stress tests, and pre-registered evaluation criteria — a coordinated effort that, alongside FAIR packaging standards [26], would convert the field's accumulated algorithmic diversity into cumulative, comparable scientific knowledge.</w:t>
+        <w:t>In closing, our view is that the field's near-term progress will be driven less by yet another deep architecture than by reproducibility, interoperability and biological validation. EMP consolidates microbiome multi-omics steps within a unified Bioconductor framework built on SummarizedExperiment and MultiAssayExperiment [8], but it is neither a universal solution nor a redundant wrapper around existing Bioconductor tools; whether its contribution matures into durable infrastructure will depend on how seriously the community takes containerisation, FAIR packaging, third-party benchmarking and longitudinal capability in the versions that follow.</w:t>
       </w:r>
     </w:p>
     <w:p>
@@ -487,7 +487,7 @@
           </w:tcPr>
           <w:p>
             <w:r>
-              <w:t>[3]</w:t>
+              <w:t>[8]</w:t>
             </w:r>
           </w:p>
         </w:tc>
@@ -497,7 +497,7 @@
           </w:tcPr>
           <w:p>
             <w:r>
-              <w:t>EasyMultiProfiler (EMP) — R workflow for microbiome multi-omics integration</w:t>
+              <w:t>EasyMultiProfiler (EMP) — R multi-omics workflow for microbiome research</w:t>
             </w:r>
           </w:p>
         </w:tc>
@@ -507,7 +507,7 @@
           </w:tcPr>
           <w:p>
             <w:r>
-              <w:t>Standardized five-module pipeline using SummarizedExperiment/MultiAssayExperiment classes for host-microbiome integration with reproducibility focus.</w:t>
+              <w:t>Unified five-module pipeline (extraction→visualization) on SummarizedExperiment/MultiAssayExperiment; standardised, reproducible microbiome multi-omics integration.</w:t>
             </w:r>
           </w:p>
         </w:tc>
@@ -517,7 +517,7 @@
           </w:tcPr>
           <w:p>
             <w:r>
-              <w:t>Microbiome-focused scope; R/SummarizedExperiment workflow requires programming expertise and dedicated infrastructure.</w:t>
+              <w:t>Restricted to microbiome/host-microbiome contexts; advanced modules assume R/Bioconductor proficiency; community validation still maturing.</w:t>
             </w:r>
           </w:p>
         </w:tc>
@@ -529,7 +529,7 @@
           </w:tcPr>
           <w:p>
             <w:r>
-              <w:t>[4]</w:t>
+              <w:t>[1]</w:t>
             </w:r>
           </w:p>
         </w:tc>
@@ -539,7 +539,7 @@
           </w:tcPr>
           <w:p>
             <w:r>
-              <w:t>MOFA — unsupervised multi-omics factor analysis (R/Python)</w:t>
+              <w:t>MOFA — statistical framework for unsupervised multi-omics integration</w:t>
             </w:r>
           </w:p>
         </w:tc>
@@ -549,7 +549,7 @@
           </w:tcPr>
           <w:p>
             <w:r>
-              <w:t>Captures shared and modality-specific variation through latent factors; supports subtyping, imputation and outlier detection.</w:t>
+              <w:t>Discovers shared and modality-specific latent factors; handles missing values and heterogeneous variance; yields interpretable factor loadings.</w:t>
             </w:r>
           </w:p>
         </w:tc>
@@ -559,7 +559,7 @@
           </w:tcPr>
           <w:p>
             <w:r>
-              <w:t>Unsupervised factors are biologically hard to interpret; primarily validated on bulk data with specific generative assumptions.</w:t>
+              <w:t>Linear-Gaussian core limits non-linear modelling; scaling to very large or single-cell datasets requires MOFA+ extensions.</w:t>
             </w:r>
           </w:p>
         </w:tc>
@@ -571,7 +571,7 @@
           </w:tcPr>
           <w:p>
             <w:r>
-              <w:t>[36]</w:t>
+              <w:t>[21]</w:t>
             </w:r>
           </w:p>
         </w:tc>
@@ -581,7 +581,7 @@
           </w:tcPr>
           <w:p>
             <w:r>
-              <w:t>mixOmics — R package for multivariate 'omics integration</w:t>
+              <w:t>mixOmics — R/Bioconductor package for multi-omics integration</w:t>
             </w:r>
           </w:p>
         </w:tc>
@@ -591,7 +591,7 @@
           </w:tcPr>
           <w:p>
             <w:r>
-              <w:t>Mature R package with PLS-based methods for dimension reduction and feature selection across multiple 'omics types.</w:t>
+              <w:t>Mature PLS-based integrative methods (sPLS, DIABLO) with built-in feature selection and rich visualisation across multiple omics.</w:t>
             </w:r>
           </w:p>
         </w:tc>
@@ -601,175 +601,7 @@
           </w:tcPr>
           <w:p>
             <w:r>
-              <w:t>Mostly pairwise PLS-based integration; less suited for very large or single-cell multi-omics datasets.</w:t>
-            </w:r>
-          </w:p>
-        </w:tc>
-      </w:tr>
-      <w:tr>
-        <w:tc>
-          <w:tcPr>
-            <w:tcW w:type="dxa" w:w="2160"/>
-          </w:tcPr>
-          <w:p>
-            <w:r>
-              <w:t>[5]</w:t>
-            </w:r>
-          </w:p>
-        </w:tc>
-        <w:tc>
-          <w:tcPr>
-            <w:tcW w:type="dxa" w:w="2160"/>
-          </w:tcPr>
-          <w:p>
-            <w:r>
-              <w:t>MOFA+ — statistical framework for single-cell multi-modal integration (Python/R)</w:t>
-            </w:r>
-          </w:p>
-        </w:tc>
-        <w:tc>
-          <w:tcPr>
-            <w:tcW w:type="dxa" w:w="2160"/>
-          </w:tcPr>
-          <w:p>
-            <w:r>
-              <w:t>Scalable variational inference with flexible sparsity priors; jointly models multi-modal single-cell data across samples.</w:t>
-            </w:r>
-          </w:p>
-        </w:tc>
-        <w:tc>
-          <w:tcPr>
-            <w:tcW w:type="dxa" w:w="2160"/>
-          </w:tcPr>
-          <w:p>
-            <w:r>
-              <w:t>Requires multi-modal single-cell data; factor interpretation remains challenging and computationally intensive at scale.</w:t>
-            </w:r>
-          </w:p>
-        </w:tc>
-      </w:tr>
-      <w:tr>
-        <w:tc>
-          <w:tcPr>
-            <w:tcW w:type="dxa" w:w="2160"/>
-          </w:tcPr>
-          <w:p>
-            <w:r>
-              <w:t>[37]</w:t>
-            </w:r>
-          </w:p>
-        </w:tc>
-        <w:tc>
-          <w:tcPr>
-            <w:tcW w:type="dxa" w:w="2160"/>
-          </w:tcPr>
-          <w:p>
-            <w:r>
-              <w:t>Similarity Network Fusion (SNF) — R/Matlab network fusion for sample integration</w:t>
-            </w:r>
-          </w:p>
-        </w:tc>
-        <w:tc>
-          <w:tcPr>
-            <w:tcW w:type="dxa" w:w="2160"/>
-          </w:tcPr>
-          <w:p>
-            <w:r>
-              <w:t>Fuses per-data-type similarity networks into a unified network; effective for cancer subtyping and survival prediction.</w:t>
-            </w:r>
-          </w:p>
-        </w:tc>
-        <w:tc>
-          <w:tcPr>
-            <w:tcW w:type="dxa" w:w="2160"/>
-          </w:tcPr>
-          <w:p>
-            <w:r>
-              <w:t>Sensitive to similarity metric and hyperparameters; designed for sample-level rather than feature-level integration.</w:t>
-            </w:r>
-          </w:p>
-        </w:tc>
-      </w:tr>
-      <w:tr>
-        <w:tc>
-          <w:tcPr>
-            <w:tcW w:type="dxa" w:w="2160"/>
-          </w:tcPr>
-          <w:p>
-            <w:r>
-              <w:t>[8]</w:t>
-            </w:r>
-          </w:p>
-        </w:tc>
-        <w:tc>
-          <w:tcPr>
-            <w:tcW w:type="dxa" w:w="2160"/>
-          </w:tcPr>
-          <w:p>
-            <w:r>
-              <w:t>MUUMI — R package for statistical meta-analysis and network-based multi-omics integration</w:t>
-            </w:r>
-          </w:p>
-        </w:tc>
-        <w:tc>
-          <w:tcPr>
-            <w:tcW w:type="dxa" w:w="2160"/>
-          </w:tcPr>
-          <w:p>
-            <w:r>
-              <w:t>Unifies single-omics meta-analysis with network-based multi-omics integration, including SNF, to find robust signatures.</w:t>
-            </w:r>
-          </w:p>
-        </w:tc>
-        <w:tc>
-          <w:tcPr>
-            <w:tcW w:type="dxa" w:w="2160"/>
-          </w:tcPr>
-          <w:p>
-            <w:r>
-              <w:t>Recently released; demonstrated primarily on IPF and macrophage datasets, so broader validation is still pending.</w:t>
-            </w:r>
-          </w:p>
-        </w:tc>
-      </w:tr>
-      <w:tr>
-        <w:tc>
-          <w:tcPr>
-            <w:tcW w:type="dxa" w:w="2160"/>
-          </w:tcPr>
-          <w:p>
-            <w:r>
-              <w:t>[30]</w:t>
-            </w:r>
-          </w:p>
-        </w:tc>
-        <w:tc>
-          <w:tcPr>
-            <w:tcW w:type="dxa" w:w="2160"/>
-          </w:tcPr>
-          <w:p>
-            <w:r>
-              <w:t>moiraine — R package for reproducible multi-omics integration pipelines</w:t>
-            </w:r>
-          </w:p>
-        </w:tc>
-        <w:tc>
-          <w:tcPr>
-            <w:tcW w:type="dxa" w:w="2160"/>
-          </w:tcPr>
-          <w:p>
-            <w:r>
-              <w:t>Automates preprocessing, formatting, visualization and side-by-side comparison of multiple integration tools.</w:t>
-            </w:r>
-          </w:p>
-        </w:tc>
-        <w:tc>
-          <w:tcPr>
-            <w:tcW w:type="dxa" w:w="2160"/>
-          </w:tcPr>
-          <w:p>
-            <w:r>
-              <w:t>Pipeline orchestrator rather than a new integration method; depends on third-party tools for actual analysis.</w:t>
+              <w:t>Predominantly linear methods; native scalability limited for very large single-cell datasets; some methods require careful tuning.</w:t>
             </w:r>
           </w:p>
         </w:tc>
@@ -791,7 +623,7 @@
           </w:tcPr>
           <w:p>
             <w:r>
-              <w:t>BioNeuralNet — Python framework for GNN-based multi-omics network analysis</w:t>
+              <w:t>MOFA+ — scalable framework for single-cell multi-modal omics</w:t>
             </w:r>
           </w:p>
         </w:tc>
@@ -801,7 +633,7 @@
           </w:tcPr>
           <w:p>
             <w:r>
-              <w:t>Modular framework interoperable with PyTorch/scikit-learn/NetworkX; supports end-to-end network-based multi-omics workflows.</w:t>
+              <w:t>Variational-inference extension of MOFA; flexible sparsity priors; joint decomposition across multiple sample groups and modalities.</w:t>
             </w:r>
           </w:p>
         </w:tc>
@@ -811,7 +643,7 @@
           </w:tcPr>
           <w:p>
             <w:r>
-              <w:t>Requires user-built networks; GNN training is data-hungry and outputs depend heavily on network quality.</w:t>
+              <w:t>Steep learning curve; designed primarily for single-cell multi-modal data; downstream interpretation often needs ML expertise.</w:t>
             </w:r>
           </w:p>
         </w:tc>
@@ -823,7 +655,7 @@
           </w:tcPr>
           <w:p>
             <w:r>
-              <w:t>[21]</w:t>
+              <w:t>[2]</w:t>
             </w:r>
           </w:p>
         </w:tc>
@@ -833,7 +665,7 @@
           </w:tcPr>
           <w:p>
             <w:r>
-              <w:t>Profiler — open-source web/desktop platform for multi-omics analysis</w:t>
+              <w:t>Similarity Network Fusion (SNF) — multi-omics integration method</w:t>
             </w:r>
           </w:p>
         </w:tc>
@@ -843,7 +675,7 @@
           </w:tcPr>
           <w:p>
             <w:r>
-              <w:t>Unified QC, preprocessing, statistics, ML/DL, biomarker and survival analyses across multiple omics types.</w:t>
+              <w:t>Builds and fuses per-modality sample similarity networks into a unified graph; effective for subtype discovery across heterogeneous data.</w:t>
             </w:r>
           </w:p>
         </w:tc>
@@ -853,7 +685,7 @@
           </w:tcPr>
           <w:p>
             <w:r>
-              <w:t>Web/desktop architecture may limit scalability; breadth of features can sacrifice depth versus specialized tools.</w:t>
+              <w:t>Sensitive to similarity-network hyperparameters; lacks native missing-data handling; limited interpretability of the fused network.</w:t>
             </w:r>
           </w:p>
         </w:tc>
@@ -865,7 +697,7 @@
           </w:tcPr>
           <w:p>
             <w:r>
-              <w:t>[33]</w:t>
+              <w:t>[47]</w:t>
             </w:r>
           </w:p>
         </w:tc>
@@ -875,7 +707,7 @@
           </w:tcPr>
           <w:p>
             <w:r>
-              <w:t>SUMO — R package for simulating multi-omics datasets</w:t>
+              <w:t>phyloseq — R/Bioconductor package for microbiome census analysis</w:t>
             </w:r>
           </w:p>
         </w:tc>
@@ -885,7 +717,7 @@
           </w:tcPr>
           <w:p>
             <w:r>
-              <w:t>Generates factor-analysis-based multi-omics data with user-controlled latent structure, shared/distinct factors and noise.</w:t>
+              <w:t>Object-oriented infrastructure for reproducible import, manipulation, statistical analysis and graphics of 16S/metagenomic data.</w:t>
             </w:r>
           </w:p>
         </w:tc>
@@ -895,7 +727,7 @@
           </w:tcPr>
           <w:p>
             <w:r>
-              <w:t>Simulation-only utility; synthetic structure may not fully capture real-world data heterogeneity and batch effects.</w:t>
+              <w:t>Single-omics (microbiome-only) with no native multi-omics integration; newer specialised algorithms live in sibling packages.</w:t>
             </w:r>
           </w:p>
         </w:tc>
@@ -907,7 +739,7 @@
           </w:tcPr>
           <w:p>
             <w:r>
-              <w:t>[22]</w:t>
+              <w:t>[52]</w:t>
             </w:r>
           </w:p>
         </w:tc>
@@ -917,7 +749,7 @@
           </w:tcPr>
           <w:p>
             <w:r>
-              <w:t>single-cell analyst — web platform for single-cell multi-omics</w:t>
+              <w:t>MetaboAnalyst 6.0 — web platform for metabolomics analysis</w:t>
             </w:r>
           </w:p>
         </w:tc>
@@ -927,7 +759,7 @@
           </w:tcPr>
           <w:p>
             <w:r>
-              <w:t>Supports six single-cell modalities plus spatial transcriptomics with automated QC, processing and many interactive visualizations.</w:t>
+              <w:t>Unified web platform for LC-MS metabolomics processing, statistics, MS2 annotation and interpretation across ~130 species.</w:t>
             </w:r>
           </w:p>
         </w:tc>
@@ -937,7 +769,7 @@
           </w:tcPr>
           <w:p>
             <w:r>
-              <w:t>GUI-driven workflow limits custom analyses; primarily single-cell focused with less bulk multi-omics flexibility.</w:t>
+              <w:t>Focused on metabolomics; web deployment limits data size; native multi-omics integration remains comparatively limited.</w:t>
             </w:r>
           </w:p>
         </w:tc>
@@ -949,7 +781,7 @@
           </w:tcPr>
           <w:p>
             <w:r>
-              <w:t>[23]</w:t>
+              <w:t>[48]</w:t>
             </w:r>
           </w:p>
         </w:tc>
@@ -959,7 +791,7 @@
           </w:tcPr>
           <w:p>
             <w:r>
-              <w:t>Analyst software suite — web-based multi-omics integration (ExpressAnalyst, MetaboAnalyst, OmicsNet, OmicsAnalyst)</w:t>
+              <w:t>QIIME 2 — extensible microbiome data analysis platform</w:t>
             </w:r>
           </w:p>
         </w:tc>
@@ -969,7 +801,7 @@
           </w:tcPr>
           <w:p>
             <w:r>
-              <w:t>Combines single-omics, knowledge-driven network integration and data-driven dimensionality reduction with documented protocols.</w:t>
+              <w:t>Standardised, reproducible, extensible microbiome workflows with plugin architecture and shareable analysis artifacts.</w:t>
             </w:r>
           </w:p>
         </w:tc>
@@ -979,7 +811,175 @@
           </w:tcPr>
           <w:p>
             <w:r>
-              <w:t>Each component handles separate omics types; cross-component workflows can be fragmented with upload size limits.</w:t>
+              <w:t>Microbiome-only, not a native multi-omics framework; plugin compatibility and learning curve can hinder new users.</w:t>
+            </w:r>
+          </w:p>
+        </w:tc>
+      </w:tr>
+      <w:tr>
+        <w:tc>
+          <w:tcPr>
+            <w:tcW w:type="dxa" w:w="2160"/>
+          </w:tcPr>
+          <w:p>
+            <w:r>
+              <w:t>[17]</w:t>
+            </w:r>
+          </w:p>
+        </w:tc>
+        <w:tc>
+          <w:tcPr>
+            <w:tcW w:type="dxa" w:w="2160"/>
+          </w:tcPr>
+          <w:p>
+            <w:r>
+              <w:t>MicrobiomeAnalyst — web tool for microbiome statistical, visual and meta-analysis</w:t>
+            </w:r>
+          </w:p>
+        </w:tc>
+        <w:tc>
+          <w:tcPr>
+            <w:tcW w:type="dxa" w:w="2160"/>
+          </w:tcPr>
+          <w:p>
+            <w:r>
+              <w:t>Comprehensive web-based statistical, visual and meta-analysis for 16S and shotgun metagenomic/metatranscriptomic datasets.</w:t>
+            </w:r>
+          </w:p>
+        </w:tc>
+        <w:tc>
+          <w:tcPr>
+            <w:tcW w:type="dxa" w:w="2160"/>
+          </w:tcPr>
+          <w:p>
+            <w:r>
+              <w:t>Single-omics focus; web upload constraints on dataset size; multi-omics integration largely outside its core scope.</w:t>
+            </w:r>
+          </w:p>
+        </w:tc>
+      </w:tr>
+      <w:tr>
+        <w:tc>
+          <w:tcPr>
+            <w:tcW w:type="dxa" w:w="2160"/>
+          </w:tcPr>
+          <w:p>
+            <w:r>
+              <w:t>[9]</w:t>
+            </w:r>
+          </w:p>
+        </w:tc>
+        <w:tc>
+          <w:tcPr>
+            <w:tcW w:type="dxa" w:w="2160"/>
+          </w:tcPr>
+          <w:p>
+            <w:r>
+              <w:t>MUUMI — R package for multi-omics meta-analysis and network integration</w:t>
+            </w:r>
+          </w:p>
+        </w:tc>
+        <w:tc>
+          <w:tcPr>
+            <w:tcW w:type="dxa" w:w="2160"/>
+          </w:tcPr>
+          <w:p>
+            <w:r>
+              <w:t>Unifies statistical meta-analysis with network-based integration (SNF, interactome inference) to identify robust molecular signatures.</w:t>
+            </w:r>
+          </w:p>
+        </w:tc>
+        <w:tc>
+          <w:tcPr>
+            <w:tcW w:type="dxa" w:w="2160"/>
+          </w:tcPr>
+          <w:p>
+            <w:r>
+              <w:t>Newer R package with narrower adoption; performance depends on availability and quality of underlying interactome priors.</w:t>
+            </w:r>
+          </w:p>
+        </w:tc>
+      </w:tr>
+      <w:tr>
+        <w:tc>
+          <w:tcPr>
+            <w:tcW w:type="dxa" w:w="2160"/>
+          </w:tcPr>
+          <w:p>
+            <w:r>
+              <w:t>[39]</w:t>
+            </w:r>
+          </w:p>
+        </w:tc>
+        <w:tc>
+          <w:tcPr>
+            <w:tcW w:type="dxa" w:w="2160"/>
+          </w:tcPr>
+          <w:p>
+            <w:r>
+              <w:t>BioNeuralNet — Python graph-neural-network framework for multi-omics networks</w:t>
+            </w:r>
+          </w:p>
+        </w:tc>
+        <w:tc>
+          <w:tcPr>
+            <w:tcW w:type="dxa" w:w="2160"/>
+          </w:tcPr>
+          <w:p>
+            <w:r>
+              <w:t>Modular Python framework using GNNs for end-to-end multi-omics network construction, embedding and downstream analyses.</w:t>
+            </w:r>
+          </w:p>
+        </w:tc>
+        <w:tc>
+          <w:tcPr>
+            <w:tcW w:type="dxa" w:w="2160"/>
+          </w:tcPr>
+          <w:p>
+            <w:r>
+              <w:t>Requires familiarity with graph neural networks and Python ML ecosystems; computational cost scales steeply with network size.</w:t>
+            </w:r>
+          </w:p>
+        </w:tc>
+      </w:tr>
+      <w:tr>
+        <w:tc>
+          <w:tcPr>
+            <w:tcW w:type="dxa" w:w="2160"/>
+          </w:tcPr>
+          <w:p>
+            <w:r>
+              <w:t>[18]</w:t>
+            </w:r>
+          </w:p>
+        </w:tc>
+        <w:tc>
+          <w:tcPr>
+            <w:tcW w:type="dxa" w:w="2160"/>
+          </w:tcPr>
+          <w:p>
+            <w:r>
+              <w:t>Profiler — open-source Python/Streamlit web platform for multi-omics analysis</w:t>
+            </w:r>
+          </w:p>
+        </w:tc>
+        <w:tc>
+          <w:tcPr>
+            <w:tcW w:type="dxa" w:w="2160"/>
+          </w:tcPr>
+          <w:p>
+            <w:r>
+              <w:t>Modular web platform with QC, statistics, ML/deep-learning, biomarker discovery, enrichment and survival analysis across modalities.</w:t>
+            </w:r>
+          </w:p>
+        </w:tc>
+        <w:tc>
+          <w:tcPr>
+            <w:tcW w:type="dxa" w:w="2160"/>
+          </w:tcPr>
+          <w:p>
+            <w:r>
+              <w:t>Currently emphasises proteomics, transcriptomics, lipidomics and EEG; web deployment constraints; still building community adoption.</w:t>
             </w:r>
           </w:p>
         </w:tc>
@@ -1008,312 +1008,322 @@
     </w:p>
     <w:p>
       <w:r>
-        <w:t>[1] Van Den Bossche T, Lazau EA, Aho VTE, Alfredo Blakeley-Ruiz J, Wolf M, Kunath BJ, et al. Integrating multi-omics technologies to decipher microbiome functions. Nat Commun. 2026;17(1):9600. doi:10.1038/s41467-026-77539-4 PMID: 42711342</w:t>
+        <w:t>[1] Argelaguet R, Velten B, Arnol D, Dietrich S, Zenz T, Marioni JC, et al. Multi-Omics Factor Analysis-a framework for unsupervised integration of multi-omics data sets. Mol Syst Biol. 2018;14(6):e8124. doi:10.15252/msb.20178124 PMID: 29925568</w:t>
       </w:r>
     </w:p>
     <w:p>
       <w:r>
-        <w:t>[2] Jiang Z, Zhang H, Gao Y, Sun Y. Multi-omics strategies for biomarker discovery and application in personalized oncology. Mol Biomed. 2025;6(1):115. doi:10.1186/s43556-025-00340-0 PMID: 41269529</w:t>
+        <w:t>[2] Wang B, Mezlini AM, Demir F, Fiume M, Tu Z, Brudno M, et al. Similarity network fusion for aggregating data types on a genomic scale. Nat Methods. 2014;11(3):333-7. doi:10.1038/nmeth.2810 PMID: 24464287</w:t>
       </w:r>
     </w:p>
     <w:p>
       <w:r>
-        <w:t>[3] Liu B, Liu Y, Xu S, Wu Q, Wu D, Zhan L, et al. EasyMultiProfiler: an efficient multi-omics data integration and analysis workflow for microbiome research. Sci China Life Sci. 2026;69(2):321-330. doi:10.1007/s11427-025-3035-0 PMID: 40932530</w:t>
+        <w:t>[3] Planell N, Lagani V, Sebastian-Leon P, van der Kloet F, Ewing E, Karathanasis N, et al. STATegra: Multi-Omics Data Integration - A Conceptual Scheme With a Bioinformatics Pipeline. Front Genet. 2021;12:620453. doi:10.3389/fgene.2021.620453 PMID: 33747045</w:t>
       </w:r>
     </w:p>
     <w:p>
       <w:r>
-        <w:t>[4] Argelaguet R, Velten B, Arnol D, Dietrich S, Zenz T, Marioni JC, et al. Multi-Omics Factor Analysis-a framework for unsupervised integration of multi-omics data sets. Mol Syst Biol. 2018;14(6):e8124. doi:10.15252/msb.20178124 PMID: 29925568</w:t>
+        <w:t>[4] Cai X, Yao Y, Zheng Y, Zhao X. Multi-omics gut microbiome signatures for treat-to-target management in inflammatory bowel disease. Microbiol Res. 2026;309:128511. doi:10.1016/j.micres.2026.128511 PMID: 41950533</w:t>
       </w:r>
     </w:p>
     <w:p>
       <w:r>
-        <w:t>[5] Argelaguet R, Arnol D, Bredikhin D, Deloro Y, Velten B, Marioni JC, et al. MOFA+: a statistical framework for comprehensive integration of multi-modal single-cell data. Genome Biol. 2020;21(1):111. doi:10.1186/s13059-020-02015-1 PMID: 32393329</w:t>
+        <w:t>[5] Zhou Z, Li Z, Wang S, Ang MY, Xiao J, Choo SW. Deep learning in tumour genomics: from multi-omics integration to precision oncology. Open Biol. 2026;16(7):260117. doi:10.1098/rsob.260117 PMID: 42379586</w:t>
       </w:r>
     </w:p>
     <w:p>
       <w:r>
-        <w:t>[6] Hirst DP, Térézol M, Cantini L, Villoutreix P, Vignes M, Baudot A. MOTL: enhancing multi-omics matrix factorization with transfer learning. Genome Biol. 2025;26(1):224. doi:10.1186/s13059-025-03675-7 PMID: 40713657</w:t>
+        <w:t>[6] Kim DY, Lee J, Choi J, Shin H, Lee JS, Kim EJ. Spatial multi-omics in precision medicine: Integrating biological insights through multidisciplinary collaboration. Semin Cancer Biol. 2026;119:24-37. doi:10.1016/j.semcancer.2025.12.009 PMID: 41475690</w:t>
       </w:r>
     </w:p>
     <w:p>
       <w:r>
-        <w:t>[7] Ren Y, Ren F, Yang B. Multi-layer matrix factorization for cancer subtyping using full and partial multi-omics dataset. Brief Bioinform. 2025;26(5):bbaf448. doi:10.1093/bib/bbaf448 PMID: 40924404</w:t>
+        <w:t>[7] Zhang S, Lv J, Zhang J, Fan Z, Gu B, Fan B, et al. Benchmarking multi-omics integrative clustering methods for subtype identification in colorectal cancer. Comput Methods Programs Biomed. 2025;261:108603. doi:10.1016/j.cmpb.2025.108603 PMID: 39826483</w:t>
       </w:r>
     </w:p>
     <w:p>
       <w:r>
-        <w:t>[8] Inkala S, Fratello M, Del Giudice G, Migliaccio G, Serra A, Greco D, et al. MUUMI: an R package for statistical and network-based meta-analysis for multi-omics data integration. BMC Bioinformatics. 2026;27(1):56. doi:10.1186/s12859-026-06394-3 PMID: 41634555</w:t>
+        <w:t>[8] Liu B, Liu Y, Xu S, Wu Q, Wu D, Zhan L, et al. EasyMultiProfiler: an efficient multi-omics data integration and analysis workflow for microbiome research. Sci China Life Sci. 2026;69(2):321-330. doi:10.1007/s11427-025-3035-0 PMID: 40932530</w:t>
       </w:r>
     </w:p>
     <w:p>
       <w:r>
-        <w:t>[9] Bodein A, Scott-Boyer MP, Perin O, Lê Cao KA, Droit A. timeOmics: an R package for longitudinal multi-omics data integration. Bioinformatics. 2022;38(2):577-579. doi:10.1093/bioinformatics/btab664 PMID: 34554215</w:t>
+        <w:t>[9] Inkala S, Fratello M, Del Giudice G, Migliaccio G, Serra A, Greco D, et al. MUUMI: an R package for statistical and network-based meta-analysis for multi-omics data integration. BMC Bioinformatics. 2026;27(1):56. doi:10.1186/s12859-026-06394-3 PMID: 41634555</w:t>
       </w:r>
     </w:p>
     <w:p>
       <w:r>
-        <w:t>[10] Bodein A, Scott-Boyer MP, Perin O, Lê Cao KA, Droit A. Interpretation of network-based integration from multi-omics longitudinal data. Nucleic Acids Res. 2022;50(5):e27. doi:10.1093/nar/gkab1200 PMID: 34883510</w:t>
+        <w:t>[10] Ruiz-Perez D, Lugo-Martinez J, Bourguignon N, Mathee K, Lerner B, Bar-Joseph Z, et al. Dynamic Bayesian Networks for Integrating Multi-omics Time Series Microbiome Data. mSystems. 2021;6(2):e01105-20. doi:10.1128/mSystems.01105-20 PMID: 33785573</w:t>
       </w:r>
     </w:p>
     <w:p>
       <w:r>
-        <w:t>[11] Odom GJ, Colaprico A, Silva TC, Chen XS, Wang L. PathwayMultiomics: An R Package for Efficient Integrative Analysis of Multi-Omics Datasets With Matched or Un-matched Samples. Front Genet. 2021;12:783713. doi:10.3389/fgene.2021.783713 PMID: 35003218</w:t>
+        <w:t>[11] Niehues A, de Visser C, Hagenbeek FA, Kulkarni P, Pool R, Karu N, et al. A multi-omics data analysis workflow packaged as a FAIR Digital Object. Gigascience. 2024;13:giad115. doi:10.1093/gigascience/giad115 PMID: 38217405</w:t>
       </w:r>
     </w:p>
     <w:p>
       <w:r>
-        <w:t>[12] Zhu B, Zhang Z, Leung SY, Fan X. NetMIM: network-based multi-omics integration with block missingness for biomarker selection and disease outcome prediction. Brief Bioinform. 2024;25(5):bbae454. doi:10.1093/bib/bbae454 PMID: 39288230</w:t>
+        <w:t>[12] Ramos M, Schiffer L, Re A, Azhar R, Basunia A, Rodriguez C, et al. Software for the Integration of Multiomics Experiments in Bioconductor. Cancer Res. 2017;77(21):e39-e42. doi:10.1158/0008-5472.CAN-17-0344 PMID: 29092936</w:t>
       </w:r>
     </w:p>
     <w:p>
       <w:r>
-        <w:t>[13] Ramos V, Hussein S, Abdel-Hafiz M, Sarkar A, Liu W, Kechris KJ, et al. BioNeuralNet: a graph neural network based Multi-Omics network data analysis tool. Bioinformatics. 2026;42(6):btag365. doi:10.1093/bioinformatics/btag365 PMID: 42274222</w:t>
+        <w:t>[13] Argelaguet R, Arnol D, Bredikhin D, Deloro Y, Velten B, Marioni JC, et al. MOFA+: a statistical framework for comprehensive integration of multi-modal single-cell data. Genome Biol. 2020;21(1):111. doi:10.1186/s13059-020-02015-1 PMID: 32393329</w:t>
       </w:r>
     </w:p>
     <w:p>
       <w:r>
-        <w:t>[14] Wu J, Chen Z, Xiao S, Liu G, Wu W, Wang S. DeepMoIC: multi-omics data integration via deep graph convolutional networks for cancer subtype classification. BMC Genomics. 2024;25(1):1209. doi:10.1186/s12864-024-11112-5 PMID: 39695368</w:t>
+        <w:t>[14] Liang C, Chen W, Gao L, Wang CD, Zhang S, Guo F. Graph-Embedded Deep Generative Clustering for Single-Cell Multi-Omics Data Integration. IEEE Trans Pattern Anal Mach Intell. 2026;48(7):7890-7901. doi:10.1109/TPAMI.2026.3667525 PMID: 41734125</w:t>
       </w:r>
     </w:p>
     <w:p>
       <w:r>
-        <w:t>[15] Gong P, Cheng L, Zhang Z, Meng A, Li E, Chen J, et al. Multi-omics integration method based on attention deep learning network for biomedical data classification. Comput Methods Programs Biomed. 2023;231:107377. doi:10.1016/j.cmpb.2023.107377 PMID: 36739624</w:t>
+        <w:t>[15] Hu Y, Wan S, Luo Y, Li Y, Wu T, Deng W, et al. Benchmarking algorithms for single-cell multi-omics prediction and integration. Nat Methods. 2024;21(11):2182-2194. doi:10.1038/s41592-024-02429-w PMID: 39322753</w:t>
       </w:r>
     </w:p>
     <w:p>
       <w:r>
-        <w:t>[16] Dou Y, Mirzaei G. MO-GCAN: multi-omics integration based on graph convolutional and attention networks. Bioinformatics. 2025;41(8):btaf405. doi:10.1093/bioinformatics/btaf405 PMID: 40692180</w:t>
+        <w:t>[16] Muñoz-Benavent M, Hartkopf F, Van Den Bossche T, Piro VC, García-Ferris C, Latorre A, et al. gNOMO: a multi-omics pipeline for integrated host and microbiome analysis of non-model organisms. NAR Genom Bioinform. 2020;2(3):lqaa058. doi:10.1093/nargab/lqaa058 PMID: 33575609</w:t>
       </w:r>
     </w:p>
     <w:p>
       <w:r>
-        <w:t>[17] Zhao J, Zhou Y, Bao H, Zhao X, Wang X, Zhao C, et al. MODA: a graph convolutional network-based multi-omics integration framework for unraveling hub molecules and disease mechanisms. Brief Bioinform. 2025;26(5):bbaf532. doi:10.1093/bib/bbaf532 PMID: 41071612</w:t>
+        <w:t>[17] Dhariwal A, Chong J, Habib S, King IL, Agellon LB, Xia J. MicrobiomeAnalyst: a web-based tool for comprehensive statistical, visual and meta-analysis of microbiome data. Nucleic Acids Res. 2017;45(W1):W180-W188. doi:10.1093/nar/gkx295 PMID: 28449106</w:t>
       </w:r>
     </w:p>
     <w:p>
       <w:r>
-        <w:t>[18] Lopez R, Regier J, Cole MB, Jordan MI, Yosef N. Deep generative modeling for single-cell transcriptomics. Nat Methods. 2018;15(12):1053-1058. doi:10.1038/s41592-018-0229-2 PMID: 30504886</w:t>
+        <w:t>[18] Zirem Y, Ledoux L, Fournier I, Salzet M. Profiler: an open web platform for multi-omics analysis. Bioinformatics. 2026;42(1):btaf644. doi:10.1093/bioinformatics/btaf644 PMID: 41324558</w:t>
       </w:r>
     </w:p>
     <w:p>
       <w:r>
-        <w:t>[19] Xu C, Lopez R, Mehlman E, Regier J, Jordan MI, Yosef N. Probabilistic harmonization and annotation of single-cell transcriptomics data with deep generative models. Mol Syst Biol. 2021;17(1):e9620. doi:10.15252/msb.20209620 PMID: 33491336</w:t>
+        <w:t>[19] Ewald JD, Zhou G, Lu Y, Kolic J, Ellis C, Johnson JD, et al. Web-based multi-omics integration using the Analyst software suite. Nat Protoc. 2024;19(5):1467-1497. doi:10.1038/s41596-023-00950-4 PMID: 38355833</w:t>
       </w:r>
     </w:p>
     <w:p>
       <w:r>
-        <w:t>[20] Gayoso A, Steier Z, Lopez R, Regier J, Nazor KL, Streets A, et al. Joint probabilistic modeling of single-cell multi-omic data with totalVI. Nat Methods. 2021;18(3):272-282. doi:10.1038/s41592-020-01050-x PMID: 33589839</w:t>
+        <w:t>[20] Zanfardino M, Castaldo R, Pane K, Affinito O, Aiello M, Salvatore M, et al. MuSA: a graphical user interface for multi-OMICs data integration in radiogenomic studies. Sci Rep. 2021;11(1):1550. doi:10.1038/s41598-021-81200-z PMID: 33452365</w:t>
       </w:r>
     </w:p>
     <w:p>
       <w:r>
-        <w:t>[21] Zirem Y, Ledoux L, Fournier I, Salzet M. Profiler: an open web platform for multi-omics analysis. Bioinformatics. 2026;42(1):btaf644. doi:10.1093/bioinformatics/btaf644 PMID: 41324558</w:t>
+        <w:t>[21] Rohart F, Gautier B, Singh A, Lê Cao KA. mixOmics: An R package for 'omics feature selection and multiple data integration. PLoS Comput Biol. 2017;13(11):e1005752. doi:10.1371/journal.pcbi.1005752 PMID: 29099853</w:t>
       </w:r>
     </w:p>
     <w:p>
       <w:r>
-        <w:t>[22] Pan L, Tang B, Zhang X, Parini P, Tremmel R, Loscalzo J, et al. Comprehensive analysis of multi-omics single-cell data using the single-cell analyst. Imeta. 2025;4(3):e70038. doi:10.1002/imt2.70038 PMID: 40469516</w:t>
+        <w:t>[22] Singh A, Shannon CP, Gautier B, Rohart F, Vacher M, Tebbutt SJ, et al. DIABLO: an integrative approach for identifying key molecular drivers from multi-omics assays. Bioinformatics. 2019;35(17):3055-3062. doi:10.1093/bioinformatics/bty1054 PMID: 30657866</w:t>
       </w:r>
     </w:p>
     <w:p>
       <w:r>
-        <w:t>[23] Ewald JD, Zhou G, Lu Y, Kolic J, Ellis C, Johnson JD, et al. Web-based multi-omics integration using the Analyst software suite. Nat Protoc. 2024;19(5):1467-1497. doi:10.1038/s41596-023-00950-4 PMID: 38355833</w:t>
+        <w:t>[23] Lê Cao KA, Costello ME, Lakis VA, Bartolo F, Chua XY, Brazeilles R, et al. MixMC: A Multivariate Statistical Framework to Gain Insight into Microbial Communities. PLoS One. 2016;11(8):e0160169. doi:10.1371/journal.pone.0160169 PMID: 27513472</w:t>
       </w:r>
     </w:p>
     <w:p>
       <w:r>
-        <w:t>[24] Li D, Min Z, Guo J, Chen Y, Zhang W. ExpOmics: a comprehensive web platform empowering biologists with robust multi-omics data analysis capabilities. Bioinformatics. 2024;40(8):btae507. doi:10.1093/bioinformatics/btae507 PMID: 39128019</w:t>
+        <w:t>[24] Garali I, Adanyeguh IM, Ichou F, Perlbarg V, Seyer A, Colsch B, et al. A strategy for multimodal data integration: application to biomarkers identification in spinocerebellar ataxia. Brief Bioinform. 2018;19(6):1356-1369. doi:10.1093/bib/bbx060 PMID: 29106465</w:t>
       </w:r>
     </w:p>
     <w:p>
       <w:r>
-        <w:t>[25] Wang N, Li Y, Han S, Zhang Y, Yang J, Yin Z, et al. CFViSA: A comprehensive and free platform for visualization and statistics in omics-data. Comput Biol Med. 2024;171:108206. doi:10.1016/j.compbiomed.2024.108206 PMID: 38430745</w:t>
+        <w:t>[25] Luong K, Joshi N, Nayak R. Semi-supervised deep matrix factorization model for clustering multi-omics data. Comput Methods Programs Biomed. 2026;273:109094. doi:10.1016/j.cmpb.2025.109094 PMID: 41086722</w:t>
       </w:r>
     </w:p>
     <w:p>
       <w:r>
-        <w:t>[26] Niehues A, de Visser C, Hagenbeek FA, Kulkarni P, Pool R, Karu N, et al. A multi-omics data analysis workflow packaged as a FAIR Digital Object. Gigascience. 2024;13:giad115. doi:10.1093/gigascience/giad115 PMID: 38217405</w:t>
+        <w:t>[26] Ren Y, Ren F, Yang B. Multi-layer matrix factorization for cancer subtyping using full and partial multi-omics dataset. Brief Bioinform. 2025;26(5):bbaf448. doi:10.1093/bib/bbaf448 PMID: 40924404</w:t>
       </w:r>
     </w:p>
     <w:p>
       <w:r>
-        <w:t>[27] Arikan M, Muth T. gNOMO2: a comprehensive and modular pipeline for integrated multi-omics analyses of microbiomes. Gigascience. 2024;13:giae038. doi:10.1093/gigascience/giae038 PMID: 38995144</w:t>
+        <w:t>[27] Hirst DP, Térézol M, Cantini L, Villoutreix P, Vignes M, Baudot A. MOTL: enhancing multi-omics matrix factorization with transfer learning. Genome Biol. 2025;26(1):224. doi:10.1186/s13059-025-03675-7 PMID: 40713657</w:t>
       </w:r>
     </w:p>
     <w:p>
       <w:r>
-        <w:t>[28] Ramos M, Schiffer L, Re A, Azhar R, Basunia A, Rodriguez C, et al. Software for the Integration of Multiomics Experiments in Bioconductor. Cancer Res. 2017;77(21):e39-e42. doi:10.1158/0008-5472.CAN-17-0344 PMID: 29092936</w:t>
+        <w:t>[28] Du L, Gao P, Liu Z, Yin N, Wang X. TMODINET: A trustworthy multi-omics dynamic learning integration network for cancer diagnostic. Comput Biol Chem. 2024;113:108202. doi:10.1016/j.compbiolchem.2024.108202 PMID: 39243551</w:t>
       </w:r>
     </w:p>
     <w:p>
       <w:r>
-        <w:t>[29] Eckenrode KB, Righelli D, Ramos M, Argelaguet R, Vanderaa C, Geistlinger L, et al. Curated single cell multimodal landmark datasets for R/Bioconductor. PLoS Comput Biol. 2023;19(8):e1011324. doi:10.1371/journal.pcbi.1011324 PMID: 37624866</w:t>
+        <w:t>[29] Gygi JP, Konstorum A, Pawar S, Aron E, Kleinstein SH, Guan L. A supervised Bayesian factor model for the identification of multi-omics signatures. bioRxiv. 2023:2023.01.25.525545. doi:10.1101/2023.01.25.525545 PMID: 36747790</w:t>
       </w:r>
     </w:p>
     <w:p>
       <w:r>
-        <w:t>[30] Angelin-Bonnet O, Guo L, Storey R, Thomson S. moiraine: an R package to construct reproducible pipelines for the application and comparison of multi-omics integration methods. Bioinformatics. 2026;42(3):btag070. doi:10.1093/bioinformatics/btag070 PMID: 41692950</w:t>
+        <w:t>[30] Wieder C, Cooke J, Frainay C, Poupin N, Bowler R, Jourdan F, et al. PathIntegrate: Multivariate modelling approaches for pathway-based multi-omics data integration. PLoS Comput Biol. 2024;20(3):e1011814. doi:10.1371/journal.pcbi.1011814 PMID: 38527092</w:t>
       </w:r>
     </w:p>
     <w:p>
       <w:r>
-        <w:t>[31] Zhang Y, Wang DD. Gut microbiome in type 2 diabetes: insights from metagenomics, multi-omics, and diet-microbe interactions. Gut Microbes. 2026;18(1):2644682. doi:10.1080/19490976.2026.2644682 PMID: 41845564</w:t>
+        <w:t>[31] Stuart T, Butler A, Hoffman P, Hafemeister C, Papalexi E, Mauck WM, et al. Comprehensive Integration of Single-Cell Data. Cell. 2019;177(7):1888-1902.e21. doi:10.1016/j.cell.2019.05.031 PMID: 31178118</w:t>
       </w:r>
     </w:p>
     <w:p>
       <w:r>
-        <w:t>[32] Muñoz-Benavent M, Hartkopf F, Van Den Bossche T, Piro VC, García-Ferris C, Latorre A, et al. gNOMO: a multi-omics pipeline for integrated host and microbiome analysis of non-model organisms. NAR Genom Bioinform. 2020;2(3):lqaa058. doi:10.1093/nargab/lqaa058 PMID: 33575609</w:t>
+        <w:t>[32] Mallick H, Rahnavard A, McIver LJ, Ma S, Zhang Y, Nguyen LH, et al. Multivariable association discovery in population-scale meta-omics studies. PLoS Comput Biol. 2021;17(11):e1009442. doi:10.1371/journal.pcbi.1009442 PMID: 34784344</w:t>
       </w:r>
     </w:p>
     <w:p>
       <w:r>
-        <w:t>[33] Osang'ir BI, Gupta S, Shkedy Z, Claesen J. SUMO: an R package for simulating multi-omics data for methods development and testing. Bioinform Adv. 2025;5(1):vbaf264. doi:10.1093/bioadv/vbaf264 PMID: 41278008</w:t>
+        <w:t>[33] Lin H, Peddada SD. Analysis of compositions of microbiomes with bias correction. Nat Commun. 2020;11(1):3514. doi:10.1038/s41467-020-17041-7 PMID: 32665548</w:t>
       </w:r>
     </w:p>
     <w:p>
       <w:r>
-        <w:t>[34] Hu Y, Wan S, Luo Y, Li Y, Wu T, Deng W, et al. Benchmarking algorithms for single-cell multi-omics prediction and integration. Nat Methods. 2024;21(11):2182-2194. doi:10.1038/s41592-024-02429-w PMID: 39322753</w:t>
+        <w:t>[34] Kuo TC, Tian TF, Tseng YJ. 3Omics: a web-based systems biology tool for analysis, integration and visualization of human transcriptomic, proteomic and metabolomic data. BMC Syst Biol. 2013;7:64. doi:10.1186/1752-0509-7-64 PMID: 23875761</w:t>
       </w:r>
     </w:p>
     <w:p>
       <w:r>
-        <w:t>[35] Xiao C, Chen Y, Meng Q, Wei L, Zhang X. Benchmarking multi-omics integration algorithms across single-cell RNA and ATAC data. Brief Bioinform. 2024;25(2):bbae095. doi:10.1093/bib/bbae095 PMID: 38493343</w:t>
+        <w:t>[35] Duruflé H, Déjean S. Multi-omics Data Integration in the Context of Plant Abiotic Stress Signaling. Methods Mol Biol. 2023;2642:295-318. doi:10.1007/978-1-0716-3044-0_16 PMID: 36944885</w:t>
       </w:r>
     </w:p>
     <w:p>
       <w:r>
-        <w:t>[36] Rohart F, Gautier B, Singh A, Lê Cao KA. mixOmics: An R package for 'omics feature selection and multiple data integration. PLoS Comput Biol. 2017;13(11):e1005752. doi:10.1371/journal.pcbi.1005752 PMID: 29099853</w:t>
+        <w:t>[36] Wu J, Chen Z, Xiao S, Liu G, Wu W, Wang S. DeepMoIC: multi-omics data integration via deep graph convolutional networks for cancer subtype classification. BMC Genomics. 2024;25(1):1209. doi:10.1186/s12864-024-11112-5 PMID: 39695368</w:t>
       </w:r>
     </w:p>
     <w:p>
       <w:r>
-        <w:t>[37] Wang B, Mezlini AM, Demir F, Fiume M, Tu Z, Brudno M, et al. Similarity network fusion for aggregating data types on a genomic scale. Nat Methods. 2014;11(3):333-7. doi:10.1038/nmeth.2810 PMID: 24464287</w:t>
+        <w:t>[37] Coletti R, Carrilho JF, Martins EP, Gonçalves CS, Costa BM, Lopes MB. A novel tool for multi-omics network integration and visualization: A study of glioma heterogeneity. Comput Biol Med. 2025;188:109811. doi:10.1016/j.compbiomed.2025.109811 PMID: 39965391</w:t>
       </w:r>
     </w:p>
     <w:p>
       <w:r>
-        <w:t>[38] Zhong Y, Peng Y, Lin Y, Chen D, Zhang H, Zheng W, et al. MODILM: towards better complex diseases classification using a novel multi-omics data integration learning model. BMC Med Inform Decis Mak. 2023;23(1):82. doi:10.1186/s12911-023-02173-9 PMID: 37147619</w:t>
+        <w:t>[38] Rong Z, Liu Z, Song J, Cao L, Yu Y, Qiu M, et al. MCluster-VAEs: An end-to-end variational deep learning-based clustering method for subtype discovery using multi-omics data. Comput Biol Med. 2022;150:106085. doi:10.1016/j.compbiomed.2022.106085 PMID: 36162197</w:t>
       </w:r>
     </w:p>
     <w:p>
       <w:r>
-        <w:t>[39] Singh A, Shannon CP, Gautier B, Rohart F, Vacher M, Tebbutt SJ, et al. DIABLO: an integrative approach for identifying key molecular drivers from multi-omics assays. Bioinformatics. 2019;35(17):3055-3062. doi:10.1093/bioinformatics/bty1054 PMID: 30657866</w:t>
+        <w:t>[39] Ramos V, Hussein S, Abdel-Hafiz M, Sarkar A, Liu W, Kechris KJ, et al. BioNeuralNet: a graph neural network based Multi-Omics network data analysis tool. Bioinformatics. 2026;42(6):btag365. doi:10.1093/bioinformatics/btag365 PMID: 42274222</w:t>
       </w:r>
     </w:p>
     <w:p>
       <w:r>
-        <w:t>[40] Luong K, Joshi N, Nayak R. Semi-supervised deep matrix factorization model for clustering multi-omics data. Comput Methods Programs Biomed. 2026;273:109094. doi:10.1016/j.cmpb.2025.109094 PMID: 41086722</w:t>
+        <w:t>[40] Huang Z, Deng Y, Liu J, Cai Z. A Graph-Based Deep Learning Framework with Gating and Omics-Linked Attention for Multi-Omics Integration and Biomarker Discovery. Biology (Basel). 2025;14(12):1764. doi:10.3390/biology14121764 PMID: 41463537</w:t>
       </w:r>
     </w:p>
     <w:p>
       <w:r>
-        <w:t>[41] Ruiz-Perez D, Lugo-Martinez J, Bourguignon N, Mathee K, Lerner B, Bar-Joseph Z, et al. Dynamic Bayesian Networks for Integrating Multi-omics Time Series Microbiome Data. mSystems. 2021;6(2):e01105-20. doi:10.1128/mSystems.01105-20 PMID: 33785573</w:t>
+        <w:t>[41] Dou Y, Mirzaei G. MO-GCAN: multi-omics integration based on graph convolutional and attention networks. Bioinformatics. 2025;41(8):btaf405. doi:10.1093/bioinformatics/btaf405 PMID: 40692180</w:t>
       </w:r>
     </w:p>
     <w:p>
       <w:r>
-        <w:t>[42] Kinkpe L, Solomon AI, Niu Y, Goswami N, Ikele CM, Hu D, et al. A guide to network analysis, multi-omics integration, and applications in livestock microbiome research. World J Microbiol Biotechnol. 2025;42(1):17. doi:10.1007/s11274-025-04755-3 PMID: 41474484</w:t>
+        <w:t>[42] Gong P, Cheng L, Zhang Z, Meng A, Li E, Chen J, et al. Multi-omics integration method based on attention deep learning network for biomedical data classification. Comput Methods Programs Biomed. 2023;231:107377. doi:10.1016/j.cmpb.2023.107377 PMID: 36739624</w:t>
       </w:r>
     </w:p>
     <w:p>
       <w:r>
-        <w:t>[43] Caudron R, Du Preez I, Luies L, Opperman M. Animal models in tuberculosis metabolomics: a systematic review of current evidence and the road to translational relevance. Front Mol Biosci. 2025;12:1688882. doi:10.3389/fmolb.2025.1688882 PMID: 41169614</w:t>
+        <w:t>[43] Yinghua M, Khan A, Heng Y, Gul Khan F, Aldhahri A, Ahmed Khan I. A contrastive adversarial encoder for multi-omics data integration. PLoS One. 2025;20(10):e0333134. doi:10.1371/journal.pone.0333134 PMID: 41100535</w:t>
       </w:r>
     </w:p>
     <w:p>
       <w:r>
-        <w:t>[44] Dinc R, Ardic N. Artificial Intelligence for Exosomal Biomarker Discovery for Cardiovascular Diseases: Multi-Omics Integration, Reproducibility, and Translational Prospects. Cells. 2026;15(3):304. doi:10.3390/cells15030304 PMID: 41677667</w:t>
+        <w:t>[44] He J, Xiao S, Huang S, Li J, Wang DH. MOKAN: A Multi-Omics Data Analysis Framework Using Kolmogorov-Arnold Networks. IEEE J Biomed Health Inform. 2026;30(2):1830-1840. doi:10.1109/JBHI.2025.3596817 PMID: 40788803</w:t>
       </w:r>
     </w:p>
     <w:p>
       <w:r>
-        <w:t>[45] Shao M, Zhang Y, Tang H, Zhou Z, Zhai M, Zhou X, et al. Multi-omics insights into immune tolerance at the maternal-fetal interface in recurrent pregnancy loss: mechanisms, integration challenges, and translational perspectives. Front Immunol. 2026;17:1811970. doi:10.3389/fimmu.2026.1811970 PMID: 42136650</w:t>
+        <w:t>[45] El Bouhaddani S, Höllerhage M, Uh HW, Moebius C, Bickle M, Höglinger G, et al. Statistical integration of multi-omics and drug screening data from cell lines. PLoS Comput Biol. 2024;20(1):e1011809. doi:10.1371/journal.pcbi.1011809 PMID: 38295113</w:t>
       </w:r>
     </w:p>
     <w:p>
       <w:r>
-        <w:t>[46] Liu X, Xu K, Tao X, Yin R, Ren G, Yu M, et al. ExpressVis: a biologist-oriented interactive web server for exploring multi-omics data. Nucleic Acids Res. 2022;50(W1):W312-W321. doi:10.1093/nar/gkac399 PMID: 35639516</w:t>
+        <w:t>[46] Zhu B, Zhang Z, Leung SY, Fan X. NetMIM: network-based multi-omics integration with block missingness for biomarker selection and disease outcome prediction. Brief Bioinform. 2024;25(5):bbae454. doi:10.1093/bib/bbae454 PMID: 39288230</w:t>
       </w:r>
     </w:p>
     <w:p>
       <w:r>
-        <w:t>[47] Nguyen T, Bian X, Roberson D, Khanna R, Chen Q, Yan C, et al. Multi-omics Pathways Workflow (MOPAW): An Automated Multi-omics Workflow on the Cancer Genomics Cloud. Cancer Inform. 2023;22:11769351231180992. doi:10.1177/11769351231180992 PMID: 37342652</w:t>
+        <w:t>[47] McMurdie PJ, Holmes S. phyloseq: an R package for reproducible interactive analysis and graphics of microbiome census data. PLoS One. 2013;8(4):e61217. doi:10.1371/journal.pone.0061217 PMID: 23630581</w:t>
       </w:r>
     </w:p>
     <w:p>
       <w:r>
-        <w:t>[48] Jang Y, Yu N, Seo J, Kim S, Lee S. MONGKIE: an integrated tool for network analysis and visualization for multi-omics data. Biol Direct. 2016;11(1):10. doi:10.1186/s13062-016-0112-y PMID: 26987515</w:t>
+        <w:t>[48] Bolyen E, Rideout JR, Dillon MR, Bokulich NA, Abnet CC, Al-Ghalith GA, et al. Reproducible, interactive, scalable and extensible microbiome data science using QIIME 2. Nat Biotechnol. 2019;37(8):852-857. doi:10.1038/s41587-019-0209-9 PMID: 31341288</w:t>
       </w:r>
     </w:p>
     <w:p>
       <w:r>
-        <w:t>[49] Shi Y, Xu B, Wang Z, Chen Q, Chai J, Wang C. PhenoMultiOmics: an enzymatic reaction inferred multi-omics network visualization web server. Bioinformatics. 2024;40(11):btae623. doi:10.1093/bioinformatics/btae623 PMID: 39418180</w:t>
+        <w:t>[49] Mehta S, Kumar P, Crane M, Johnson JE, Sajulga R, Nguyen DDA, et al. Updates on metaQuantome Software for Quantitative Metaproteomics. J Proteome Res. 2021;20(4):2130-2137. doi:10.1021/acs.jproteome.0c00960 PMID: 33683127</w:t>
       </w:r>
     </w:p>
     <w:p>
       <w:r>
-        <w:t>[50] Totu T, Riudavets Puig R, Häuser LJ, Tomasoni M, Bolck HA, Buljan M. NOODAI: a webserver for network-oriented multi-omics data analysis and integration pipeline. Bioinformatics. 2025;41(11):btaf553. doi:10.1093/bioinformatics/btaf553 PMID: 41051225</w:t>
+        <w:t>[50] Bodein A, Scott-Boyer MP, Perin O, Lê Cao KA, Droit A. timeOmics: an R package for longitudinal multi-omics data integration. Bioinformatics. 2022;38(2):577-579. doi:10.1093/bioinformatics/btab664 PMID: 34554215</w:t>
       </w:r>
     </w:p>
     <w:p>
       <w:r>
-        <w:t>[51] Li Z, Xu Z, Li X. SportsXbiodata: A web platform for integrative analysis of exercise-induced gene and protein expression. iScience. 2026;29(1):114403. doi:10.1016/j.isci.2025.114403 PMID: 41550722</w:t>
+        <w:t>[51] Bodein A, Scott-Boyer MP, Perin O, Lê Cao KA, Droit A. Interpretation of network-based integration from multi-omics longitudinal data. Nucleic Acids Res. 2022;50(5):e27. doi:10.1093/nar/gkab1200 PMID: 34883510</w:t>
       </w:r>
     </w:p>
     <w:p>
       <w:r>
-        <w:t>[52] Luo H, Yang Y, Gong Z, Liu L, Chen Y. LOSTdb: a manually curated multi-omics database for lung cancer research. BMC Bioinformatics. 2025;26(1):290. doi:10.1186/s12859-025-06319-6 PMID: 41339793</w:t>
+        <w:t>[52] Pang Z, Lu Y, Zhou G, Hui F, Xu L, Viau C, et al. MetaboAnalyst 6.0: towards a unified platform for metabolomics data processing, analysis and interpretation. Nucleic Acids Res. 2024;52(W1):W398-W406. doi:10.1093/nar/gkae253 PMID: 38587201</w:t>
       </w:r>
     </w:p>
     <w:p>
       <w:r>
-        <w:t>[53] Yinghua M, Khan A, Heng Y, Gul Khan F, Aldhahri A, Ahmed Khan I. A contrastive adversarial encoder for multi-omics data integration. PLoS One. 2025;20(10):e0333134. doi:10.1371/journal.pone.0333134 PMID: 41100535</w:t>
+        <w:t>[53] Pan L, Tang B, Zhang X, Parini P, Tremmel R, Loscalzo J, et al. Comprehensive analysis of multi-omics single-cell data using the single-cell analyst. Imeta. 2025;4(3):e70038. doi:10.1002/imt2.70038 PMID: 40469516</w:t>
       </w:r>
     </w:p>
     <w:p>
       <w:r>
-        <w:t>[54] Ramos V, Hussein S, Abdel-Hafiz M, Sarkar A, Liu W, Kechris KJ, et al. BioNeuralNet: A Graph Neural Network based Multi-Omics Network Data Analysis Tool. ArXiv. 2025:arXiv:2507.20440v1. PMID: 40740520</w:t>
+        <w:t>[54] Jang Y, Yu N, Seo J, Kim S, Lee S. MONGKIE: an integrated tool for network analysis and visualization for multi-omics data. Biol Direct. 2016;11(1):10. doi:10.1186/s13062-016-0112-y PMID: 26987515</w:t>
       </w:r>
     </w:p>
     <w:p>
       <w:r>
-        <w:t>[55] Zhang Y, Xiong S, Wang Z, Liu Y, Luo H, Li B, et al. Local augmented graph neural network for multi-omics cancer prognosis prediction and analysis. Methods. 2023;213:1-9. doi:10.1016/j.ymeth.2023.02.011 PMID: 36933628</w:t>
+        <w:t>[55] Totu T, Riudavets Puig R, Häuser LJ, Tomasoni M, Bolck HA, Buljan M. NOODAI: a webserver for network-oriented multi-omics data analysis and integration pipeline. Bioinformatics. 2025;41(11):btaf553. doi:10.1093/bioinformatics/btaf553 PMID: 41051225</w:t>
       </w:r>
     </w:p>
     <w:p>
       <w:r>
-        <w:t>[56] Liu Y, Li HD, Wang J. CrossIsoFun: predicting isoform functions using the integration of multi-omics data. Bioinformatics. 2024;41(1):btae742. doi:10.1093/bioinformatics/btae742 PMID: 39680906</w:t>
+        <w:t>[56] Fang Y, Fan M, Li H, Xu H, Du H, Guo Y, et al. CPMOAD: comprehensive preeclampsia multi-omics analysis database. J Transl Med. 2025;23(1):1026. doi:10.1186/s12967-025-07094-x PMID: 41029413</w:t>
       </w:r>
     </w:p>
     <w:p>
       <w:r>
-        <w:t>[57] ElKarami B, Alkhateeb A, Qattous H, Alshomali L, Shahrrava B. Multi-omics Data Integration Model Based on UMAP Embedding and Convolutional Neural Network. Cancer Inform. 2022;21:11769351221124205. doi:10.1177/11769351221124205 PMID: 36187912</w:t>
+        <w:t>[57] Sharma A, Debik J, Naume B, Ohnstad HO, Oslo Breast Cancer Consortium (OSBREAC), Bathen TF, et al. Comprehensive multi-omics analysis of breast cancer reveals distinct long-term prognostic subtypes. Oncogenesis. 2024;13(1):22. doi:10.1038/s41389-024-00521-6 PMID: 38871719</w:t>
       </w:r>
     </w:p>
     <w:p>
       <w:r>
-        <w:t>[58] Coletti R, Carrilho JF, Martins EP, Gonçalves CS, Costa BM, Lopes MB. A novel tool for multi-omics network integration and visualization: A study of glioma heterogeneity. Comput Biol Med. 2025;188:109811. doi:10.1016/j.compbiomed.2025.109811 PMID: 39965391</w:t>
+        <w:t>[58] Matsuda K, Yuda J, Yoshimaru R, Harima I, Sakuma H, Uehara A, et al. SCRUM-Japan MONSTAR3 hematology cohort: a nationwide multi-omics integrated platform for next-generation precision medicine in hematologic malignancies. Int J Clin Oncol. 2026;31(7):1108-1116. doi:10.1007/s10147-026-03049-4 PMID: 42177352</w:t>
       </w:r>
     </w:p>
     <w:p>
       <w:r>
-        <w:t>[59] Du L, Gao P, Liu Z, Yin N, Wang X. TMODINET: A trustworthy multi-omics dynamic learning integration network for cancer diagnostic. Comput Biol Chem. 2024;113:108202. doi:10.1016/j.compbiolchem.2024.108202 PMID: 39243551</w:t>
+        <w:t>[59] Borisov N, Ilnytsky Y, Byeon B, Kovalchuk O, Kovalchuk I. Multi-omics data integration for topology-based pathway activation assessment and personalized drug ranking. Mol Omics. 2025;21(6):678-689. doi:10.1039/d5mo00151j PMID: 41031899</w:t>
       </w:r>
     </w:p>
     <w:p>
       <w:r>
-        <w:t>[60] Luo X, Huang Y, Zeng H, Tao Y, Bao X, Feng F, et al. CelLink: integrating single-cell multi-omics data with weak feature linkage and imbalanced cell populations. Nucleic Acids Res. 2025;53(22):gkaf1270. doi:10.1093/nar/gkaf1270 PMID: 41335468</w:t>
+        <w:t>[60] Dinc R, Ardic N. Artificial Intelligence for Exosomal Biomarker Discovery for Cardiovascular Diseases: Multi-Omics Integration, Reproducibility, and Translational Prospects. Cells. 2026;15(3):304. doi:10.3390/cells15030304 PMID: 41677667</w:t>
       </w:r>
     </w:p>
     <w:p>
       <w:r>
-        <w:t>[61] Beghini F, McIver LJ, Blanco-Míguez A, Dubois L, Asnicar F, Maharjan S, et al. Integrating taxonomic, functional, and strain-level profiling of diverse microbial communities with bioBakery 3. Elife. 2021;10:e65088. doi:10.7554/eLife.65088 PMID: 33944776</w:t>
+        <w:t>[61] Shao M, Zhang Y, Tang H, Zhou Z, Zhai M, Zhou X, et al. Multi-omics insights into immune tolerance at the maternal-fetal interface in recurrent pregnancy loss: mechanisms, integration challenges, and translational perspectives. Front Immunol. 2026;17:1811970. doi:10.3389/fimmu.2026.1811970 PMID: 42136650</w:t>
       </w:r>
     </w:p>
     <w:p>
       <w:r>
-        <w:t>[62] Tong L, Mitchel J, Chatlin K, Wang MD. Deep learning based feature-level integration of multi-omics data for breast cancer patients survival analysis. BMC Med Inform Decis Mak. 2020;20(1):225. doi:10.1186/s12911-020-01225-8 PMID: 32933515</w:t>
+        <w:t>[62] Vaidya H, Kumar M. AI in multi-omics analysis in viral diseases. Prog Mol Biol Transl Sci. 2026;222:229-240. doi:10.1016/bs.pmbts.2026.02.005 PMID: 42173631</w:t>
+      </w:r>
+    </w:p>
+    <w:p>
+      <w:r>
+        <w:t>[63] Ghosh B, Das G, Pal S, Khatua S, Ghosh Z. AI in multi-omics analysis in stem cell research. Prog Mol Biol Transl Sci. 2026;222:129-142. doi:10.1016/bs.pmbts.2026.01.014 PMID: 42173627</w:t>
+      </w:r>
+    </w:p>
+    <w:p>
+      <w:r>
+        <w:t>[64] Li FH, Li YY, Zhang Y, Yang L, Pan SK, Liu DW, et al. Emerging multidimensional biomarker system for cardiovascular-kidney-metabolic syndrome: from multi-omics integration to clinical artificial intelligence. Cardiovasc Diabetol. 2026;25(1):173. doi:10.1186/s12933-026-03178-0 PMID: 42036643</w:t>
       </w:r>
     </w:p>
     <w:sectPr>

</xml_diff>